<commit_message>
Add comprehensive churn dashboard guide as Word document.
Includes section-by-section dashboard documentation, churn formulas, compute() walkthrough, and file map.

Co-authored-by: Cursor <cursoragent@cursor.com>
</commit_message>
<xml_diff>
--- a/documentation/Live_Seller_Churn_Analysis_Documentation.docx
+++ b/documentation/Live_Seller_Churn_Analysis_Documentation.docx
@@ -74,10 +74,20 @@
           <w:rFonts w:ascii="Courier New" w:hAnsi="Courier New"/>
           <w:sz w:val="18"/>
         </w:rPr>
+        <w:t>documentation/Live_Seller_Churn_Dashboard_Guide.docx</w:t>
+      </w:r>
+      <w:r>
+        <w:t>](documentation/Live_Seller_Churn_Dashboard_Guide.docx) (full dashboard guide) · [</w:t>
+      </w:r>
+      <w:r>
+        <w:rPr>
+          <w:rFonts w:ascii="Courier New" w:hAnsi="Courier New"/>
+          <w:sz w:val="18"/>
+        </w:rPr>
         <w:t>documentation/Live_Seller_Churn_Analysis_Documentation.docx</w:t>
       </w:r>
       <w:r>
-        <w:t>](documentation/Live_Seller_Churn_Analysis_Documentation.docx) (same content as this README)</w:t>
+        <w:t>](documentation/Live_Seller_Churn_Analysis_Documentation.docx) (repo overview)</w:t>
       </w:r>
     </w:p>
     <w:p/>
@@ -628,9 +638,13 @@
         <w:br/>
         <w:t>├── documentation/</w:t>
         <w:br/>
-        <w:t>│   ├── Live_Seller_Churn_Analysis_Documentation.docx   # Word copy of this README</w:t>
+        <w:t>│   ├── Live_Seller_Churn_Dashboard_Guide.docx          # ★ Dashboard guide (Word)</w:t>
         <w:br/>
-        <w:t>│   └── README.txt                                      # Pointer for Word users</w:t>
+        <w:t>│   ├── Live_Seller_Churn_Analysis_Documentation.docx # Repo overview (Word)</w:t>
+        <w:br/>
+        <w:t>│   ├── churn_dashboard_guide.md                      # Dashboard guide source</w:t>
+        <w:br/>
+        <w:t>│   └── README.txt                                    # Pointer for documentation folder</w:t>
         <w:br/>
         <w:t>├── data/</w:t>
         <w:br/>

</xml_diff>

<commit_message>
Consolidate documentation into single Word doc with clear churn definitions.
Remove dashboard guide docx; merge condensed content into Live_Seller_Churn_Analysis_Documentation.docx.

Co-authored-by: Cursor <cursoragent@cursor.com>
</commit_message>
<xml_diff>
--- a/documentation/Live_Seller_Churn_Analysis_Documentation.docx
+++ b/documentation/Live_Seller_Churn_Analysis_Documentation.docx
@@ -7,21 +7,7 @@
         <w:pStyle w:val="Title"/>
       </w:pPr>
       <w:r>
-        <w:t>Live Seller Churn Analysis</w:t>
-      </w:r>
-    </w:p>
-    <w:p>
-      <w:r>
-        <w:t xml:space="preserve">Interactive dashboard and data pipeline for </w:t>
-      </w:r>
-      <w:r>
-        <w:rPr>
-          <w:b/>
-        </w:rPr>
-        <w:t>eBay Live seller churn</w:t>
-      </w:r>
-      <w:r>
-        <w:t xml:space="preserve"> in 2026.</w:t>
+        <w:t>Live Seller Churn Analysis — Documentation</w:t>
       </w:r>
     </w:p>
     <w:p>
@@ -30,99 +16,10 @@
         <w:rPr>
           <w:b/>
         </w:rPr>
-        <w:t>Open the dashboard:</w:t>
+        <w:t>Dashboard:</w:t>
       </w:r>
       <w:r>
-        <w:t xml:space="preserve"> [</w:t>
-      </w:r>
-      <w:r>
-        <w:rPr>
-          <w:rFonts w:ascii="Courier New" w:hAnsi="Courier New"/>
-          <w:sz w:val="18"/>
-        </w:rPr>
-        <w:t>dashboard/live_seller_churn_dashboard_20260618.html</w:t>
-      </w:r>
-      <w:r>
-        <w:t>](dashboard/live_seller_churn_dashboard_20260618.html)</w:t>
-      </w:r>
-    </w:p>
-    <w:p>
-      <w:r/>
-      <w:r>
-        <w:rPr>
-          <w:b/>
-        </w:rPr>
-        <w:t>Repository:</w:t>
-      </w:r>
-      <w:r>
-        <w:t xml:space="preserve"> github.com/devkashikar/live-seller-churn-analysis (https://github.com/devkashikar/live-seller-churn-analysis)</w:t>
-      </w:r>
-    </w:p>
-    <w:p>
-      <w:r/>
-      <w:r>
-        <w:rPr>
-          <w:b/>
-        </w:rPr>
-        <w:t>Word documentation:</w:t>
-      </w:r>
-      <w:r>
-        <w:t xml:space="preserve"> [</w:t>
-      </w:r>
-      <w:r>
-        <w:rPr>
-          <w:rFonts w:ascii="Courier New" w:hAnsi="Courier New"/>
-          <w:sz w:val="18"/>
-        </w:rPr>
-        <w:t>documentation/Live_Seller_Churn_Dashboard_Guide.docx</w:t>
-      </w:r>
-      <w:r>
-        <w:t>](documentation/Live_Seller_Churn_Dashboard_Guide.docx) (full dashboard guide) · [</w:t>
-      </w:r>
-      <w:r>
-        <w:rPr>
-          <w:rFonts w:ascii="Courier New" w:hAnsi="Courier New"/>
-          <w:sz w:val="18"/>
-        </w:rPr>
-        <w:t>documentation/Live_Seller_Churn_Analysis_Documentation.docx</w:t>
-      </w:r>
-      <w:r>
-        <w:t>](documentation/Live_Seller_Churn_Analysis_Documentation.docx) (repo overview)</w:t>
-      </w:r>
-    </w:p>
-    <w:p/>
-    <w:p>
-      <w:pPr>
-        <w:pStyle w:val="Heading1"/>
-      </w:pPr>
-      <w:r>
-        <w:t>Where churn is calculated (read this first)</w:t>
-      </w:r>
-    </w:p>
-    <w:p>
-      <w:pPr>
-        <w:pStyle w:val="IntenseQuote"/>
-      </w:pPr>
-      <w:r/>
-      <w:r>
-        <w:rPr>
-          <w:b/>
-        </w:rPr>
-        <w:t>All churn metrics shown in the current dashboard are calculated in JavaScript inside one file:</w:t>
-      </w:r>
-      <w:r/>
-    </w:p>
-    <w:p>
-      <w:r>
-        <w:t>&gt;</w:t>
-      </w:r>
-    </w:p>
-    <w:p>
-      <w:pPr>
-        <w:pStyle w:val="IntenseQuote"/>
-      </w:pPr>
-      <w:r>
-        <w:t xml:space="preserve">### </w:t>
+        <w:t xml:space="preserve"> </w:t>
       </w:r>
       <w:r>
         <w:rPr>
@@ -134,32 +31,29 @@
       <w:r/>
     </w:p>
     <w:p>
+      <w:r/>
       <w:r>
-        <w:t>&gt;</w:t>
+        <w:rPr>
+          <w:b/>
+        </w:rPr>
+        <w:t>Repository:</w:t>
+      </w:r>
+      <w:r>
+        <w:t xml:space="preserve"> https://github.com/devkashikar/live-seller-churn-analysis</w:t>
+      </w:r>
+    </w:p>
+    <w:p/>
+    <w:p>
+      <w:pPr>
+        <w:pStyle w:val="Heading1"/>
+      </w:pPr>
+      <w:r>
+        <w:t>How churn is calculated (most important)</w:t>
       </w:r>
     </w:p>
     <w:p>
-      <w:pPr>
-        <w:pStyle w:val="IntenseQuote"/>
-      </w:pPr>
       <w:r>
-        <w:t>| Function | What it calculates |</w:t>
-      </w:r>
-    </w:p>
-    <w:p>
-      <w:pPr>
-        <w:pStyle w:val="IntenseQuote"/>
-      </w:pPr>
-      <w:r>
-        <w:t>|----------|-------------------|</w:t>
-      </w:r>
-    </w:p>
-    <w:p>
-      <w:pPr>
-        <w:pStyle w:val="IntenseQuote"/>
-      </w:pPr>
-      <w:r>
-        <w:t xml:space="preserve">| </w:t>
+        <w:t xml:space="preserve">All churn metrics are computed in the browser by </w:t>
       </w:r>
       <w:r>
         <w:rPr>
@@ -168,522 +62,17 @@
         <w:t>`compute()`</w:t>
       </w:r>
       <w:r>
-        <w:t xml:space="preserve"> | </w:t>
-      </w:r>
-      <w:r>
-        <w:rPr>
-          <w:b/>
-        </w:rPr>
-        <w:t>Core engine</w:t>
-      </w:r>
-      <w:r>
-        <w:t xml:space="preserve"> — cohort assignment, 3-week gap churn, new/growing/mature tenure churn, cohort sizes |</w:t>
-      </w:r>
-    </w:p>
-    <w:p>
-      <w:pPr>
-        <w:pStyle w:val="IntenseQuote"/>
-      </w:pPr>
-      <w:r>
-        <w:t xml:space="preserve">| </w:t>
-      </w:r>
-      <w:r>
-        <w:rPr>
-          <w:b/>
-        </w:rPr>
-        <w:t>`renderStats(res)`</w:t>
-      </w:r>
-      <w:r>
-        <w:t xml:space="preserve"> | </w:t>
-      </w:r>
-      <w:r>
-        <w:rPr>
-          <w:b/>
-        </w:rPr>
-        <w:t>Summary cards</w:t>
-      </w:r>
-      <w:r>
-        <w:t xml:space="preserve"> — weighted average churn % for new / growing / mature sellers + total sellers |</w:t>
-      </w:r>
-    </w:p>
-    <w:p>
-      <w:pPr>
-        <w:pStyle w:val="IntenseQuote"/>
-      </w:pPr>
-      <w:r>
-        <w:t xml:space="preserve">| </w:t>
-      </w:r>
-      <w:r>
-        <w:rPr>
-          <w:b/>
-        </w:rPr>
-        <w:t>`renderTable(res)`</w:t>
-      </w:r>
-      <w:r>
-        <w:t xml:space="preserve"> | </w:t>
-      </w:r>
-      <w:r>
-        <w:rPr>
-          <w:b/>
-        </w:rPr>
-        <w:t>Heatmap table</w:t>
-      </w:r>
-      <w:r>
-        <w:t xml:space="preserve"> — per-cohort churn % or counts from </w:t>
+        <w:t xml:space="preserve"> in </w:t>
       </w:r>
       <w:r>
         <w:rPr>
           <w:rFonts w:ascii="Courier New" w:hAnsi="Courier New"/>
           <w:sz w:val="18"/>
         </w:rPr>
-        <w:t>gapChurn[]</w:t>
+        <w:t>dashboard/live_seller_churn_dashboard_20260618.html</w:t>
       </w:r>
       <w:r>
-        <w:t xml:space="preserve"> |</w:t>
-      </w:r>
-    </w:p>
-    <w:p>
-      <w:pPr>
-        <w:pStyle w:val="IntenseQuote"/>
-      </w:pPr>
-      <w:r>
-        <w:t xml:space="preserve">| </w:t>
-      </w:r>
-      <w:r>
-        <w:rPr>
-          <w:b/>
-        </w:rPr>
-        <w:t>`renderChart(res)`</w:t>
-      </w:r>
-      <w:r>
-        <w:t xml:space="preserve"> | </w:t>
-      </w:r>
-      <w:r>
-        <w:rPr>
-          <w:b/>
-        </w:rPr>
-        <w:t>Line chart</w:t>
-      </w:r>
-      <w:r>
-        <w:t xml:space="preserve"> — per-cohort churn % at W4, W10, W16 |</w:t>
-      </w:r>
-    </w:p>
-    <w:p>
-      <w:pPr>
-        <w:pStyle w:val="IntenseQuote"/>
-      </w:pPr>
-      <w:r>
-        <w:t xml:space="preserve">| </w:t>
-      </w:r>
-      <w:r>
-        <w:rPr>
-          <w:b/>
-        </w:rPr>
-        <w:t>`refresh()`</w:t>
-      </w:r>
-      <w:r>
-        <w:t xml:space="preserve"> | Orchestrator — calls </w:t>
-      </w:r>
-      <w:r>
-        <w:rPr>
-          <w:rFonts w:ascii="Courier New" w:hAnsi="Courier New"/>
-          <w:sz w:val="18"/>
-        </w:rPr>
-        <w:t>compute()</w:t>
-      </w:r>
-      <w:r>
-        <w:t xml:space="preserve"> then all three render functions |</w:t>
-      </w:r>
-    </w:p>
-    <w:p>
-      <w:r/>
-      <w:r>
-        <w:rPr>
-          <w:b/>
-        </w:rPr>
-        <w:t>No Python file computes dashboard churn.</w:t>
-      </w:r>
-      <w:r>
-        <w:t xml:space="preserve"> Python only converts CSV → JSON.</w:t>
-      </w:r>
-    </w:p>
-    <w:tbl>
-      <w:tblPr>
-        <w:tblStyle w:val="TableGrid"/>
-        <w:tblW w:type="auto" w:w="0"/>
-        <w:tblLook w:firstColumn="1" w:firstRow="1" w:lastColumn="0" w:lastRow="0" w:noHBand="0" w:noVBand="1" w:val="04A0"/>
-      </w:tblPr>
-      <w:tblGrid>
-        <w:gridCol w:w="4320"/>
-        <w:gridCol w:w="4320"/>
-      </w:tblGrid>
-      <w:tr>
-        <w:tc>
-          <w:tcPr>
-            <w:tcW w:type="dxa" w:w="4320"/>
-            <w:shd w:fill="E8EEF4" w:val="clear"/>
-          </w:tcPr>
-          <w:p>
-            <w:r>
-              <w:rPr>
-                <w:b/>
-              </w:rPr>
-              <w:t>File</w:t>
-            </w:r>
-          </w:p>
-        </w:tc>
-        <w:tc>
-          <w:tcPr>
-            <w:tcW w:type="dxa" w:w="4320"/>
-            <w:shd w:fill="E8EEF4" w:val="clear"/>
-          </w:tcPr>
-          <w:p>
-            <w:r>
-              <w:rPr>
-                <w:b/>
-              </w:rPr>
-              <w:t>Calculates churn?</w:t>
-            </w:r>
-          </w:p>
-        </w:tc>
-      </w:tr>
-      <w:tr>
-        <w:tc>
-          <w:tcPr>
-            <w:tcW w:type="dxa" w:w="4320"/>
-          </w:tcPr>
-          <w:p>
-            <w:r>
-              <w:t>`dashboard/live_seller_churn_dashboard_20260618.html`</w:t>
-            </w:r>
-          </w:p>
-        </w:tc>
-        <w:tc>
-          <w:tcPr>
-            <w:tcW w:type="dxa" w:w="4320"/>
-          </w:tcPr>
-          <w:p>
-            <w:r>
-              <w:t>Yes — all current metrics</w:t>
-            </w:r>
-          </w:p>
-        </w:tc>
-      </w:tr>
-      <w:tr>
-        <w:tc>
-          <w:tcPr>
-            <w:tcW w:type="dxa" w:w="4320"/>
-          </w:tcPr>
-          <w:p>
-            <w:r>
-              <w:t>`scripts/build_canvas.py`</w:t>
-            </w:r>
-          </w:p>
-        </w:tc>
-        <w:tc>
-          <w:tcPr>
-            <w:tcW w:type="dxa" w:w="4320"/>
-          </w:tcPr>
-          <w:p>
-            <w:r>
-              <w:t>No — data prep only</w:t>
-            </w:r>
-          </w:p>
-        </w:tc>
-      </w:tr>
-      <w:tr>
-        <w:tc>
-          <w:tcPr>
-            <w:tcW w:type="dxa" w:w="4320"/>
-          </w:tcPr>
-          <w:p>
-            <w:r>
-              <w:t>`scripts/build_html.py`</w:t>
-            </w:r>
-          </w:p>
-        </w:tc>
-        <w:tc>
-          <w:tcPr>
-            <w:tcW w:type="dxa" w:w="4320"/>
-          </w:tcPr>
-          <w:p>
-            <w:r>
-              <w:t>Yes — legacy definition only (active in last week, not tenure churn)</w:t>
-            </w:r>
-          </w:p>
-        </w:tc>
-      </w:tr>
-      <w:tr>
-        <w:tc>
-          <w:tcPr>
-            <w:tcW w:type="dxa" w:w="4320"/>
-          </w:tcPr>
-          <w:p>
-            <w:r>
-              <w:t>`tools/check.js`</w:t>
-            </w:r>
-          </w:p>
-        </w:tc>
-        <w:tc>
-          <w:tcPr>
-            <w:tcW w:type="dxa" w:w="4320"/>
-          </w:tcPr>
-          <w:p>
-            <w:r>
-              <w:t>Copy of dashboard JS for validation (same logic as HTML)</w:t>
-            </w:r>
-          </w:p>
-        </w:tc>
-      </w:tr>
-      <w:tr>
-        <w:tc>
-          <w:tcPr>
-            <w:tcW w:type="dxa" w:w="4320"/>
-          </w:tcPr>
-          <w:p>
-            <w:r>
-              <w:t>`data/raw/streams_first_stream_2026.csv`</w:t>
-            </w:r>
-          </w:p>
-        </w:tc>
-        <w:tc>
-          <w:tcPr>
-            <w:tcW w:type="dxa" w:w="4320"/>
-          </w:tcPr>
-          <w:p>
-            <w:r>
-              <w:t>Raw events — no calculations</w:t>
-            </w:r>
-          </w:p>
-        </w:tc>
-      </w:tr>
-      <w:tr>
-        <w:tc>
-          <w:tcPr>
-            <w:tcW w:type="dxa" w:w="4320"/>
-          </w:tcPr>
-          <w:p>
-            <w:r>
-              <w:t>`data/processed/canvas_data.json`</w:t>
-            </w:r>
-          </w:p>
-        </w:tc>
-        <w:tc>
-          <w:tcPr>
-            <w:tcW w:type="dxa" w:w="4320"/>
-          </w:tcPr>
-          <w:p>
-            <w:r>
-              <w:t>Structured seller/week data — no churn fields</w:t>
-            </w:r>
-          </w:p>
-        </w:tc>
-      </w:tr>
-    </w:tbl>
-    <w:p/>
-    <w:p/>
-    <w:p>
-      <w:pPr>
-        <w:pStyle w:val="Heading1"/>
-      </w:pPr>
-      <w:r>
-        <w:t>End-to-end data flow</w:t>
-      </w:r>
-    </w:p>
-    <w:p>
-      <w:pPr>
-        <w:spacing w:before="120" w:after="120"/>
-        <w:ind w:left="240"/>
-      </w:pPr>
-      <w:r>
-        <w:rPr>
-          <w:rFonts w:ascii="Courier New" w:hAnsi="Courier New"/>
-          <w:sz w:val="18"/>
-        </w:rPr>
-        <w:t>flowchart LR</w:t>
-        <w:br/>
-        <w:t xml:space="preserve">  CSV["data/raw/streams_first_stream_2026.csv"]</w:t>
-        <w:br/>
-        <w:t xml:space="preserve">  BUILD["scripts/build_canvas.py"]</w:t>
-        <w:br/>
-        <w:t xml:space="preserve">  JSON["data/processed/canvas_data.json"]</w:t>
-        <w:br/>
-        <w:t xml:space="preserve">  HTML["dashboard/live_seller_churn_dashboard_20260618.html"]</w:t>
-        <w:br/>
-        <w:t xml:space="preserve">  USER["Browser"]</w:t>
-        <w:br/>
-        <w:br/>
-        <w:t xml:space="preserve">  CSV --&gt; BUILD</w:t>
-        <w:br/>
-        <w:t xml:space="preserve">  BUILD --&gt; JSON</w:t>
-        <w:br/>
-        <w:t xml:space="preserve">  JSON -.-&gt;|"embedded as const DATA"| HTML</w:t>
-        <w:br/>
-        <w:t xml:space="preserve">  HTML --&gt;|"compute() on load + filter change"| USER</w:t>
-      </w:r>
-    </w:p>
-    <w:p>
-      <w:pPr>
-        <w:pStyle w:val="ListNumber"/>
-      </w:pPr>
-      <w:r/>
-      <w:r>
-        <w:rPr>
-          <w:b/>
-        </w:rPr>
-        <w:t>Upstream extract</w:t>
-      </w:r>
-      <w:r>
-        <w:t xml:space="preserve"> produces the CSV (one row per stream).</w:t>
-      </w:r>
-    </w:p>
-    <w:p>
-      <w:pPr>
-        <w:pStyle w:val="ListNumber"/>
-      </w:pPr>
-      <w:r/>
-      <w:r>
-        <w:rPr>
-          <w:b/>
-        </w:rPr>
-        <w:t>`scripts/build_canvas.py`</w:t>
-      </w:r>
-      <w:r>
-        <w:t xml:space="preserve"> reads CSV, groups by seller, writes compact JSON.</w:t>
-      </w:r>
-    </w:p>
-    <w:p>
-      <w:pPr>
-        <w:pStyle w:val="ListNumber"/>
-      </w:pPr>
-      <w:r>
-        <w:t xml:space="preserve">JSON is </w:t>
-      </w:r>
-      <w:r>
-        <w:rPr>
-          <w:b/>
-        </w:rPr>
-        <w:t>embedded</w:t>
-      </w:r>
-      <w:r>
-        <w:t xml:space="preserve"> in the HTML as </w:t>
-      </w:r>
-      <w:r>
-        <w:rPr>
-          <w:rFonts w:ascii="Courier New" w:hAnsi="Courier New"/>
-          <w:sz w:val="18"/>
-        </w:rPr>
-        <w:t>const DATA = { … }</w:t>
-      </w:r>
-      <w:r>
-        <w:t xml:space="preserve"> (the repo ships a pre-embedded copy).</w:t>
-      </w:r>
-    </w:p>
-    <w:p>
-      <w:pPr>
-        <w:pStyle w:val="ListNumber"/>
-      </w:pPr>
-      <w:r>
-        <w:t xml:space="preserve">Opening the HTML in a browser runs </w:t>
-      </w:r>
-      <w:r>
-        <w:rPr>
-          <w:b/>
-        </w:rPr>
-        <w:t>`compute()`</w:t>
-      </w:r>
-      <w:r>
-        <w:t xml:space="preserve"> — all churn numbers are computed at runtime.</w:t>
-      </w:r>
-    </w:p>
-    <w:p>
-      <w:pPr>
-        <w:pStyle w:val="ListNumber"/>
-      </w:pPr>
-      <w:r>
-        <w:t xml:space="preserve">Changing filters re-runs </w:t>
-      </w:r>
-      <w:r>
-        <w:rPr>
-          <w:b/>
-        </w:rPr>
-        <w:t>`compute()`</w:t>
-      </w:r>
-      <w:r>
-        <w:t xml:space="preserve"> instantly (no server).</w:t>
-      </w:r>
-    </w:p>
-    <w:p/>
-    <w:p>
-      <w:pPr>
-        <w:pStyle w:val="Heading1"/>
-      </w:pPr>
-      <w:r>
-        <w:t>Project layout</w:t>
-      </w:r>
-    </w:p>
-    <w:p>
-      <w:pPr>
-        <w:spacing w:before="120" w:after="120"/>
-        <w:ind w:left="240"/>
-      </w:pPr>
-      <w:r>
-        <w:rPr>
-          <w:rFonts w:ascii="Courier New" w:hAnsi="Courier New"/>
-          <w:sz w:val="18"/>
-        </w:rPr>
-        <w:t>live-seller-churn-analysis/</w:t>
-        <w:br/>
-        <w:t>├── README.md</w:t>
-        <w:br/>
-        <w:t>├── documentation/</w:t>
-        <w:br/>
-        <w:t>│   ├── Live_Seller_Churn_Dashboard_Guide.docx          # ★ Dashboard guide (Word)</w:t>
-        <w:br/>
-        <w:t>│   ├── Live_Seller_Churn_Analysis_Documentation.docx # Repo overview (Word)</w:t>
-        <w:br/>
-        <w:t>│   ├── churn_dashboard_guide.md                      # Dashboard guide source</w:t>
-        <w:br/>
-        <w:t>│   └── README.txt                                    # Pointer for documentation folder</w:t>
-        <w:br/>
-        <w:t>├── data/</w:t>
-        <w:br/>
-        <w:t>│   ├── raw/</w:t>
-        <w:br/>
-        <w:t>│   │   └── streams_first_stream_2026.csv      # INPUT: source extract</w:t>
-        <w:br/>
-        <w:t>│   └── processed/</w:t>
-        <w:br/>
-        <w:t>│       └── canvas_data.json                   # INTERMEDIATE: seller/week JSON</w:t>
-        <w:br/>
-        <w:t>├── dashboard/</w:t>
-        <w:br/>
-        <w:t>│   ├── live_seller_churn_dashboard_20260618.html   # ★ MAIN — churn math lives here</w:t>
-        <w:br/>
-        <w:t>│   └── live_seller_churn_dashboard_20260617.html   # Older UI (outdated card logic)</w:t>
-        <w:br/>
-        <w:t>├── scripts/</w:t>
-        <w:br/>
-        <w:t>│   ├── build_canvas.py                        # CSV → JSON (no churn)</w:t>
-        <w:br/>
-        <w:t>│   ├── build_html.py                          # Legacy dashboard builder</w:t>
-        <w:br/>
-        <w:t>│   └── build_documentation_docx.py            # README.md → Word doc</w:t>
-        <w:br/>
-        <w:t>└── tools/</w:t>
-        <w:br/>
-        <w:t xml:space="preserve">    ├── check.js                               # Dashboard JS mirror for tests</w:t>
-        <w:br/>
-        <w:t xml:space="preserve">    └── harness.js                             # Runs compute() smoke test</w:t>
-      </w:r>
-    </w:p>
-    <w:p/>
-    <w:p>
-      <w:pPr>
-        <w:pStyle w:val="Heading1"/>
-      </w:pPr>
-      <w:r>
-        <w:t>File reference (detailed)</w:t>
+        <w:t>. No Python file calculates dashboard churn.</w:t>
       </w:r>
     </w:p>
     <w:p>
@@ -691,2035 +80,76 @@
         <w:pStyle w:val="Heading2"/>
       </w:pPr>
       <w:r>
-        <w:t>Data — input</w:t>
+        <w:t>Core rule</w:t>
       </w:r>
     </w:p>
     <w:p>
-      <w:pPr>
-        <w:pStyle w:val="Heading3"/>
-      </w:pPr>
       <w:r>
-        <w:t>`data/raw/streams_first_stream_2026.csv`</w:t>
-      </w:r>
-    </w:p>
-    <w:p>
-      <w:r/>
-      <w:r>
-        <w:rPr>
-          <w:b/>
-        </w:rPr>
-        <w:t>Role:</w:t>
-      </w:r>
-      <w:r>
-        <w:t xml:space="preserve"> Single source of truth for stream-level events.</w:t>
-      </w:r>
-    </w:p>
-    <w:p>
-      <w:pPr>
-        <w:pStyle w:val="ListBullet"/>
-      </w:pPr>
-      <w:r/>
-      <w:r>
-        <w:rPr>
-          <w:b/>
-        </w:rPr>
-        <w:t>One row = one live stream</w:t>
-      </w:r>
-      <w:r>
-        <w:t xml:space="preserve"> (not one seller).</w:t>
-      </w:r>
-    </w:p>
-    <w:p>
-      <w:pPr>
-        <w:pStyle w:val="ListBullet"/>
-      </w:pPr>
-      <w:r/>
-      <w:r>
-        <w:rPr>
-          <w:b/>
-        </w:rPr>
-        <w:t>Does not contain churn</w:t>
-      </w:r>
-      <w:r>
-        <w:t xml:space="preserve"> — only raw attributes and dates.</w:t>
-      </w:r>
-    </w:p>
-    <w:tbl>
-      <w:tblPr>
-        <w:tblStyle w:val="TableGrid"/>
-        <w:tblW w:type="auto" w:w="0"/>
-        <w:tblLook w:firstColumn="1" w:firstRow="1" w:lastColumn="0" w:lastRow="0" w:noHBand="0" w:noVBand="1" w:val="04A0"/>
-      </w:tblPr>
-      <w:tblGrid>
-        <w:gridCol w:w="2880"/>
-        <w:gridCol w:w="2880"/>
-        <w:gridCol w:w="2880"/>
-      </w:tblGrid>
-      <w:tr>
-        <w:tc>
-          <w:tcPr>
-            <w:tcW w:type="dxa" w:w="2880"/>
-            <w:shd w:fill="E8EEF4" w:val="clear"/>
-          </w:tcPr>
-          <w:p>
-            <w:r>
-              <w:rPr>
-                <w:b/>
-              </w:rPr>
-              <w:t>Column</w:t>
-            </w:r>
-          </w:p>
-        </w:tc>
-        <w:tc>
-          <w:tcPr>
-            <w:tcW w:type="dxa" w:w="2880"/>
-            <w:shd w:fill="E8EEF4" w:val="clear"/>
-          </w:tcPr>
-          <w:p>
-            <w:r>
-              <w:rPr>
-                <w:b/>
-              </w:rPr>
-              <w:t>Meaning</w:t>
-            </w:r>
-          </w:p>
-        </w:tc>
-        <w:tc>
-          <w:tcPr>
-            <w:tcW w:type="dxa" w:w="2880"/>
-            <w:shd w:fill="E8EEF4" w:val="clear"/>
-          </w:tcPr>
-          <w:p>
-            <w:r>
-              <w:rPr>
-                <w:b/>
-              </w:rPr>
-              <w:t>Used by</w:t>
-            </w:r>
-          </w:p>
-        </w:tc>
-      </w:tr>
-      <w:tr>
-        <w:tc>
-          <w:tcPr>
-            <w:tcW w:type="dxa" w:w="2880"/>
-          </w:tcPr>
-          <w:p>
-            <w:r>
-              <w:t>`SLR_ID`</w:t>
-            </w:r>
-          </w:p>
-        </w:tc>
-        <w:tc>
-          <w:tcPr>
-            <w:tcW w:type="dxa" w:w="2880"/>
-          </w:tcPr>
-          <w:p>
-            <w:r>
-              <w:t>Seller ID</w:t>
-            </w:r>
-          </w:p>
-        </w:tc>
-        <w:tc>
-          <w:tcPr>
-            <w:tcW w:type="dxa" w:w="2880"/>
-          </w:tcPr>
-          <w:p>
-            <w:r>
-              <w:t>`build_canvas.py` → group streams per seller</w:t>
-            </w:r>
-          </w:p>
-        </w:tc>
-      </w:tr>
-      <w:tr>
-        <w:tc>
-          <w:tcPr>
-            <w:tcW w:type="dxa" w:w="2880"/>
-          </w:tcPr>
-          <w:p>
-            <w:r>
-              <w:t>`ID`</w:t>
-            </w:r>
-          </w:p>
-        </w:tc>
-        <w:tc>
-          <w:tcPr>
-            <w:tcW w:type="dxa" w:w="2880"/>
-          </w:tcPr>
-          <w:p>
-            <w:r>
-              <w:t>Stream / event ID</w:t>
-            </w:r>
-          </w:p>
-        </w:tc>
-        <w:tc>
-          <w:tcPr>
-            <w:tcW w:type="dxa" w:w="2880"/>
-          </w:tcPr>
-          <w:p>
-            <w:r>
-              <w:t>Identifies individual streams (not used in churn math directly)</w:t>
-            </w:r>
-          </w:p>
-        </w:tc>
-      </w:tr>
-      <w:tr>
-        <w:tc>
-          <w:tcPr>
-            <w:tcW w:type="dxa" w:w="2880"/>
-          </w:tcPr>
-          <w:p>
-            <w:r>
-              <w:t>`STRT_TM`</w:t>
-            </w:r>
-          </w:p>
-        </w:tc>
-        <w:tc>
-          <w:tcPr>
-            <w:tcW w:type="dxa" w:w="2880"/>
-          </w:tcPr>
-          <w:p>
-            <w:r>
-              <w:t>Stream start timestamp</w:t>
-            </w:r>
-          </w:p>
-        </w:tc>
-        <w:tc>
-          <w:tcPr>
-            <w:tcW w:type="dxa" w:w="2880"/>
-          </w:tcPr>
-          <w:p>
-            <w:r>
-              <w:t>Aligns with `RETAIL_WEEK` in source; not parsed in our pipeline</w:t>
-            </w:r>
-          </w:p>
-        </w:tc>
-      </w:tr>
-      <w:tr>
-        <w:tc>
-          <w:tcPr>
-            <w:tcW w:type="dxa" w:w="2880"/>
-          </w:tcPr>
-          <w:p>
-            <w:r>
-              <w:t>`RETAIL_WEEK`</w:t>
-            </w:r>
-          </w:p>
-        </w:tc>
-        <w:tc>
-          <w:tcPr>
-            <w:tcW w:type="dxa" w:w="2880"/>
-          </w:tcPr>
-          <w:p>
-            <w:r>
-              <w:t>2026 retail week for this stream row</w:t>
-            </w:r>
-          </w:p>
-        </w:tc>
-        <w:tc>
-          <w:tcPr>
-            <w:tcW w:type="dxa" w:w="2880"/>
-          </w:tcPr>
-          <w:p>
-            <w:r>
-              <w:t>Week assignment for every stream</w:t>
-            </w:r>
-          </w:p>
-        </w:tc>
-      </w:tr>
-      <w:tr>
-        <w:tc>
-          <w:tcPr>
-            <w:tcW w:type="dxa" w:w="2880"/>
-          </w:tcPr>
-          <w:p>
-            <w:r>
-              <w:t>`first_stream_dt`</w:t>
-            </w:r>
-          </w:p>
-        </w:tc>
-        <w:tc>
-          <w:tcPr>
-            <w:tcW w:type="dxa" w:w="2880"/>
-          </w:tcPr>
-          <w:p>
-            <w:r>
-              <w:t>Seller’s first-ever Live date (repeated per row)</w:t>
-            </w:r>
-          </w:p>
-        </w:tc>
-        <w:tc>
-          <w:tcPr>
-            <w:tcW w:type="dxa" w:w="2880"/>
-          </w:tcPr>
-          <w:p>
-            <w:r>
-              <w:t>Upstream; cohort = min `RETAIL_WEEK` per seller in our code</w:t>
-            </w:r>
-          </w:p>
-        </w:tc>
-      </w:tr>
-      <w:tr>
-        <w:tc>
-          <w:tcPr>
-            <w:tcW w:type="dxa" w:w="2880"/>
-          </w:tcPr>
-          <w:p>
-            <w:r>
-              <w:t>`SELLER_COUNTRY`</w:t>
-            </w:r>
-          </w:p>
-        </w:tc>
-        <w:tc>
-          <w:tcPr>
-            <w:tcW w:type="dxa" w:w="2880"/>
-          </w:tcPr>
-          <w:p>
-            <w:r>
-              <w:t>Country</w:t>
-            </w:r>
-          </w:p>
-        </w:tc>
-        <w:tc>
-          <w:tcPr>
-            <w:tcW w:type="dxa" w:w="2880"/>
-          </w:tcPr>
-          <w:p>
-            <w:r>
-              <w:t>Dashboard country filter</w:t>
-            </w:r>
-          </w:p>
-        </w:tc>
-      </w:tr>
-      <w:tr>
-        <w:tc>
-          <w:tcPr>
-            <w:tcW w:type="dxa" w:w="2880"/>
-          </w:tcPr>
-          <w:p>
-            <w:r>
-              <w:t>`FCSD_VRTCL_SUP_GRP_revised`</w:t>
-            </w:r>
-          </w:p>
-        </w:tc>
-        <w:tc>
-          <w:tcPr>
-            <w:tcW w:type="dxa" w:w="2880"/>
-          </w:tcPr>
-          <w:p>
-            <w:r>
-              <w:t>Sub category</w:t>
-            </w:r>
-          </w:p>
-        </w:tc>
-        <w:tc>
-          <w:tcPr>
-            <w:tcW w:type="dxa" w:w="2880"/>
-          </w:tcPr>
-          <w:p>
-            <w:r>
-              <w:t>Dashboard vertical filter</w:t>
-            </w:r>
-          </w:p>
-        </w:tc>
-      </w:tr>
-      <w:tr>
-        <w:tc>
-          <w:tcPr>
-            <w:tcW w:type="dxa" w:w="2880"/>
-          </w:tcPr>
-          <w:p>
-            <w:r>
-              <w:t>`Seller_Tier_Tranche`, `Org`</w:t>
-            </w:r>
-          </w:p>
-        </w:tc>
-        <w:tc>
-          <w:tcPr>
-            <w:tcW w:type="dxa" w:w="2880"/>
-          </w:tcPr>
-          <w:p>
-            <w:r>
-              <w:t>Seller attributes</w:t>
-            </w:r>
-          </w:p>
-        </w:tc>
-        <w:tc>
-          <w:tcPr>
-            <w:tcW w:type="dxa" w:w="2880"/>
-          </w:tcPr>
-          <w:p>
-            <w:r>
-              <w:t>Stored in JSON; not used in current dashboard filters</w:t>
-            </w:r>
-          </w:p>
-        </w:tc>
-      </w:tr>
-    </w:tbl>
-    <w:p/>
-    <w:p>
-      <w:r>
-        <w:t xml:space="preserve">Rows with </w:t>
-      </w:r>
-      <w:r>
-        <w:rPr>
-          <w:rFonts w:ascii="Courier New" w:hAnsi="Courier New"/>
-          <w:sz w:val="18"/>
-        </w:rPr>
-        <w:t>RETAIL_WEEK = 53</w:t>
-      </w:r>
-      <w:r>
-        <w:t xml:space="preserve"> are skipped in </w:t>
-      </w:r>
-      <w:r>
-        <w:rPr>
-          <w:rFonts w:ascii="Courier New" w:hAnsi="Courier New"/>
-          <w:sz w:val="18"/>
-        </w:rPr>
-        <w:t>build_canvas.py</w:t>
-      </w:r>
-      <w:r>
-        <w:t>.</w:t>
-      </w:r>
-    </w:p>
-    <w:p/>
-    <w:p>
-      <w:pPr>
-        <w:pStyle w:val="Heading2"/>
-      </w:pPr>
-      <w:r>
-        <w:t>Data — processed</w:t>
-      </w:r>
-    </w:p>
-    <w:p>
-      <w:pPr>
-        <w:pStyle w:val="Heading3"/>
-      </w:pPr>
-      <w:r>
-        <w:t>`data/processed/canvas_data.json`</w:t>
-      </w:r>
-    </w:p>
-    <w:p>
-      <w:r/>
-      <w:r>
-        <w:rPr>
-          <w:b/>
-        </w:rPr>
-        <w:t>Role:</w:t>
-      </w:r>
-      <w:r>
-        <w:t xml:space="preserve"> Compact dataset for the dashboard. </w:t>
+        <w:t xml:space="preserve">A seller is </w:t>
       </w:r>
       <w:r>
         <w:rPr>
           <w:b/>
         </w:rPr>
-        <w:t>Generated file — do not edit by hand.</w:t>
+        <w:t>churned</w:t>
       </w:r>
-      <w:r/>
-    </w:p>
-    <w:p>
-      <w:r/>
+      <w:r>
+        <w:t xml:space="preserve"> for a given check if they had </w:t>
+      </w:r>
       <w:r>
         <w:rPr>
           <w:b/>
         </w:rPr>
-        <w:t>Produced by:</w:t>
+        <w:t>no live stream</w:t>
       </w:r>
       <w:r>
-        <w:t xml:space="preserve"> </w:t>
+        <w:t xml:space="preserve"> in the defined </w:t>
       </w:r>
-      <w:r>
-        <w:rPr>
-          <w:rFonts w:ascii="Courier New" w:hAnsi="Courier New"/>
-          <w:sz w:val="18"/>
-        </w:rPr>
-        <w:t>python scripts/build_canvas.py</w:t>
-      </w:r>
-      <w:r/>
-    </w:p>
-    <w:p>
-      <w:r/>
       <w:r>
         <w:rPr>
           <w:b/>
         </w:rPr>
-        <w:t>Structure:</w:t>
-      </w:r>
-      <w:r/>
-    </w:p>
-    <w:p>
-      <w:pPr>
-        <w:spacing w:before="120" w:after="120"/>
-        <w:ind w:left="240"/>
-      </w:pPr>
-      <w:r>
-        <w:rPr>
-          <w:rFonts w:ascii="Courier New" w:hAnsi="Courier New"/>
-          <w:sz w:val="18"/>
-        </w:rPr>
-        <w:t>{</w:t>
-        <w:br/>
-        <w:t xml:space="preserve">  "countries": ["UK", "IT", "US", ...],</w:t>
-        <w:br/>
-        <w:t xml:space="preserve">  "tiers": [...],</w:t>
-        <w:br/>
-        <w:t xml:space="preserve">  "orgs": [...],</w:t>
-        <w:br/>
-        <w:t xml:space="preserve">  "verticals": ["Trading Cards CCG", ...],</w:t>
-        <w:br/>
-        <w:t xml:space="preserve">  "sellers": [</w:t>
-        <w:br/>
-        <w:t xml:space="preserve">    {</w:t>
-        <w:br/>
-        <w:t xml:space="preserve">      "c": 0,           // index into countries[]</w:t>
-        <w:br/>
-        <w:t xml:space="preserve">      "t": 2,           // index into tiers[]</w:t>
-        <w:br/>
-        <w:t xml:space="preserve">      "o": 1,           // index into orgs[]</w:t>
-        <w:br/>
-        <w:t xml:space="preserve">      "wv": [[5, 3], [6, 3], [10, 12], ...]  // [retail_week, vertical_index] per stream week</w:t>
-        <w:br/>
-        <w:t xml:space="preserve">    }</w:t>
-        <w:br/>
-        <w:t xml:space="preserve">  ]</w:t>
-        <w:br/>
-        <w:t>}</w:t>
-      </w:r>
-    </w:p>
-    <w:p>
-      <w:r/>
-      <w:r>
-        <w:rPr>
-          <w:b/>
-        </w:rPr>
-        <w:t>What is NOT in this file:</w:t>
-      </w:r>
-      <w:r>
-        <w:t xml:space="preserve"> churn flags, cohort labels, weighted averages, or pre-aggregated cohort tables. Those are derived at runtime in </w:t>
-      </w:r>
-      <w:r>
-        <w:rPr>
-          <w:rFonts w:ascii="Courier New" w:hAnsi="Courier New"/>
-          <w:sz w:val="18"/>
-        </w:rPr>
-        <w:t>compute()</w:t>
-      </w:r>
-      <w:r>
-        <w:t>.</w:t>
-      </w:r>
-    </w:p>
-    <w:p/>
-    <w:p>
-      <w:pPr>
-        <w:pStyle w:val="Heading2"/>
-      </w:pPr>
-      <w:r>
-        <w:t>Dashboard — primary application</w:t>
-      </w:r>
-    </w:p>
-    <w:p>
-      <w:pPr>
-        <w:pStyle w:val="Heading3"/>
-      </w:pPr>
-      <w:r>
-        <w:t>`dashboard/live_seller_churn_dashboard_20260618.html` ★</w:t>
-      </w:r>
-    </w:p>
-    <w:p>
-      <w:r/>
-      <w:r>
-        <w:rPr>
-          <w:b/>
-        </w:rPr>
-        <w:t>Role:</w:t>
-      </w:r>
-      <w:r>
-        <w:t xml:space="preserve"> The live product. Self-contained HTML + CSS + embedded </w:t>
-      </w:r>
-      <w:r>
-        <w:rPr>
-          <w:rFonts w:ascii="Courier New" w:hAnsi="Courier New"/>
-          <w:sz w:val="18"/>
-        </w:rPr>
-        <w:t>DATA</w:t>
-      </w:r>
-      <w:r>
-        <w:t xml:space="preserve"> + all business logic.</w:t>
-      </w:r>
-    </w:p>
-    <w:p>
-      <w:pPr>
-        <w:pStyle w:val="Heading3"/>
-      </w:pPr>
-      <w:r>
-        <w:t>JavaScript architecture</w:t>
-      </w:r>
-    </w:p>
-    <w:p>
-      <w:pPr>
-        <w:spacing w:before="120" w:after="120"/>
-        <w:ind w:left="240"/>
-      </w:pPr>
-      <w:r>
-        <w:rPr>
-          <w:rFonts w:ascii="Courier New" w:hAnsi="Courier New"/>
-          <w:sz w:val="18"/>
-        </w:rPr>
-        <w:t>refresh()</w:t>
-        <w:br/>
-        <w:t xml:space="preserve">  ├── compute()          → { rows[], maxWeek, minWeek, totals }</w:t>
-        <w:br/>
-        <w:t xml:space="preserve">  ├── renderStats(res)   → summary cards (weighted churn)</w:t>
-        <w:br/>
-        <w:t xml:space="preserve">  ├── renderTable(res)   → heatmap</w:t>
-        <w:br/>
-        <w:t xml:space="preserve">  └── renderChart(res)   → cohort line chart</w:t>
-      </w:r>
-    </w:p>
-    <w:p>
-      <w:pPr>
-        <w:pStyle w:val="Heading3"/>
-      </w:pPr>
-      <w:r>
-        <w:t>`compute()` — detailed breakdown</w:t>
-      </w:r>
-    </w:p>
-    <w:p>
-      <w:r>
-        <w:t xml:space="preserve">Location: </w:t>
-      </w:r>
-      <w:r>
-        <w:rPr>
-          <w:rFonts w:ascii="Courier New" w:hAnsi="Courier New"/>
-          <w:sz w:val="18"/>
-        </w:rPr>
-        <w:t>&lt;script&gt;</w:t>
-      </w:r>
-      <w:r>
-        <w:t xml:space="preserve"> block, function </w:t>
-      </w:r>
-      <w:r>
-        <w:rPr>
-          <w:rFonts w:ascii="Courier New" w:hAnsi="Courier New"/>
-          <w:sz w:val="18"/>
-        </w:rPr>
-        <w:t>compute()</w:t>
-      </w:r>
-      <w:r>
-        <w:t xml:space="preserve"> (~line 333).</w:t>
-      </w:r>
-    </w:p>
-    <w:p>
-      <w:r/>
-      <w:r>
-        <w:rPr>
-          <w:b/>
-        </w:rPr>
-        <w:t>Step 1 — Apply filters and build cohort buckets</w:t>
-      </w:r>
-      <w:r/>
-    </w:p>
-    <w:p>
-      <w:r>
-        <w:t xml:space="preserve">For each seller in </w:t>
-      </w:r>
-      <w:r>
-        <w:rPr>
-          <w:rFonts w:ascii="Courier New" w:hAnsi="Courier New"/>
-          <w:sz w:val="18"/>
-        </w:rPr>
-        <w:t>DATA.sellers</w:t>
-      </w:r>
-      <w:r>
-        <w:t>:</w:t>
-      </w:r>
-    </w:p>
-    <w:p>
-      <w:pPr>
-        <w:pStyle w:val="ListNumber"/>
-      </w:pPr>
-      <w:r>
-        <w:t>Skip if country filter doesn’t match (</w:t>
-      </w:r>
-      <w:r>
-        <w:rPr>
-          <w:rFonts w:ascii="Courier New" w:hAnsi="Courier New"/>
-          <w:sz w:val="18"/>
-        </w:rPr>
-        <w:t>DATA.countries[s.c]</w:t>
-      </w:r>
-      <w:r>
-        <w:t>).</w:t>
-      </w:r>
-    </w:p>
-    <w:p>
-      <w:pPr>
-        <w:pStyle w:val="ListNumber"/>
-      </w:pPr>
-      <w:r>
-        <w:t xml:space="preserve">Build </w:t>
-      </w:r>
-      <w:r>
-        <w:rPr>
-          <w:rFonts w:ascii="Courier New" w:hAnsi="Courier New"/>
-          <w:sz w:val="18"/>
-        </w:rPr>
-        <w:t>weeks</w:t>
-      </w:r>
-      <w:r>
-        <w:t xml:space="preserve"> = set of retail weeks from </w:t>
-      </w:r>
-      <w:r>
-        <w:rPr>
-          <w:rFonts w:ascii="Courier New" w:hAnsi="Courier New"/>
-          <w:sz w:val="18"/>
-        </w:rPr>
-        <w:t>s.wv</w:t>
-      </w:r>
-      <w:r>
-        <w:t>, optionally filtered by sub category.</w:t>
-      </w:r>
-    </w:p>
-    <w:p>
-      <w:pPr>
-        <w:pStyle w:val="ListNumber"/>
-      </w:pPr>
-      <w:r>
-        <w:t>Skip seller if no weeks remain after vertical filter.</w:t>
-      </w:r>
-    </w:p>
-    <w:p>
-      <w:pPr>
-        <w:pStyle w:val="ListNumber"/>
-      </w:pPr>
-      <w:r/>
-      <w:r>
-        <w:rPr>
-          <w:b/>
-        </w:rPr>
-        <w:t>Cohort</w:t>
-      </w:r>
-      <w:r>
-        <w:t xml:space="preserve"> = </w:t>
-      </w:r>
-      <w:r>
-        <w:rPr>
-          <w:rFonts w:ascii="Courier New" w:hAnsi="Courier New"/>
-          <w:sz w:val="18"/>
-        </w:rPr>
-        <w:t>min(weeks)</w:t>
-      </w:r>
-      <w:r>
-        <w:t xml:space="preserve"> → seller’s first-stream retail week.</w:t>
-      </w:r>
-    </w:p>
-    <w:p>
-      <w:pPr>
-        <w:pStyle w:val="ListNumber"/>
-      </w:pPr>
-      <w:r>
-        <w:t xml:space="preserve">Skip if cohort ∈ </w:t>
-      </w:r>
-      <w:r>
-        <w:rPr>
-          <w:rFonts w:ascii="Courier New" w:hAnsi="Courier New"/>
-          <w:sz w:val="18"/>
-        </w:rPr>
-        <w:t>EXCLUDED_COHORTS</w:t>
-      </w:r>
-      <w:r>
-        <w:t xml:space="preserve"> (21, 22, 23, 24).</w:t>
-      </w:r>
-    </w:p>
-    <w:p>
-      <w:pPr>
-        <w:pStyle w:val="ListNumber"/>
-      </w:pPr>
-      <w:r>
-        <w:t xml:space="preserve">Append </w:t>
-      </w:r>
-      <w:r>
-        <w:rPr>
-          <w:rFonts w:ascii="Courier New" w:hAnsi="Courier New"/>
-          <w:sz w:val="18"/>
-        </w:rPr>
-        <w:t>weeks</w:t>
-      </w:r>
-      <w:r>
-        <w:t xml:space="preserve"> to </w:t>
-      </w:r>
-      <w:r>
-        <w:rPr>
-          <w:rFonts w:ascii="Courier New" w:hAnsi="Courier New"/>
-          <w:sz w:val="18"/>
-        </w:rPr>
-        <w:t>cohortMembers[cohort]</w:t>
+        <w:t>week window</w:t>
       </w:r>
       <w:r>
         <w:t>.</w:t>
       </w:r>
     </w:p>
     <w:p>
-      <w:r/>
       <w:r>
-        <w:rPr>
-          <w:b/>
-        </w:rPr>
-        <w:t>Step 2 — Per-cohort metrics</w:t>
-      </w:r>
-      <w:r>
-        <w:t xml:space="preserve"> (loop over each cohort </w:t>
-      </w:r>
-      <w:r>
-        <w:rPr>
-          <w:rFonts w:ascii="Courier New" w:hAnsi="Courier New"/>
-          <w:sz w:val="18"/>
-        </w:rPr>
-        <w:t>c</w:t>
-      </w:r>
-      <w:r>
-        <w:t>)</w:t>
-      </w:r>
-    </w:p>
-    <w:tbl>
-      <w:tblPr>
-        <w:tblStyle w:val="TableGrid"/>
-        <w:tblW w:type="auto" w:w="0"/>
-        <w:tblLook w:firstColumn="1" w:firstRow="1" w:lastColumn="0" w:lastRow="0" w:noHBand="0" w:noVBand="1" w:val="04A0"/>
-      </w:tblPr>
-      <w:tblGrid>
-        <w:gridCol w:w="4320"/>
-        <w:gridCol w:w="4320"/>
-      </w:tblGrid>
-      <w:tr>
-        <w:tc>
-          <w:tcPr>
-            <w:tcW w:type="dxa" w:w="4320"/>
-            <w:shd w:fill="E8EEF4" w:val="clear"/>
-          </w:tcPr>
-          <w:p>
-            <w:r>
-              <w:rPr>
-                <w:b/>
-              </w:rPr>
-              <w:t>Output field</w:t>
-            </w:r>
-          </w:p>
-        </w:tc>
-        <w:tc>
-          <w:tcPr>
-            <w:tcW w:type="dxa" w:w="4320"/>
-            <w:shd w:fill="E8EEF4" w:val="clear"/>
-          </w:tcPr>
-          <w:p>
-            <w:r>
-              <w:rPr>
-                <w:b/>
-              </w:rPr>
-              <w:t>Calculation</w:t>
-            </w:r>
-          </w:p>
-        </w:tc>
-      </w:tr>
-      <w:tr>
-        <w:tc>
-          <w:tcPr>
-            <w:tcW w:type="dxa" w:w="4320"/>
-          </w:tcPr>
-          <w:p>
-            <w:r>
-              <w:t>`size`</w:t>
-            </w:r>
-          </w:p>
-        </w:tc>
-        <w:tc>
-          <w:tcPr>
-            <w:tcW w:type="dxa" w:w="4320"/>
-          </w:tcPr>
-          <w:p>
-            <w:r>
-              <w:t>Number of sellers in cohort</w:t>
-            </w:r>
-          </w:p>
-        </w:tc>
-      </w:tr>
-      <w:tr>
-        <w:tc>
-          <w:tcPr>
-            <w:tcW w:type="dxa" w:w="4320"/>
-          </w:tcPr>
-          <w:p>
-            <w:r>
-              <w:t>`gapChurn[k]`</w:t>
-            </w:r>
-          </w:p>
-        </w:tc>
-        <w:tc>
-          <w:tcPr>
-            <w:tcW w:type="dxa" w:w="4320"/>
-          </w:tcPr>
-          <w:p>
-            <w:r>
-              <w:t>For column Wk (`k ≥ 4`): count of sellers with no stream in weeks `c+k-3`, `c+k-2`, `c+k-1`. `null` for `k &lt; 4`.</w:t>
-            </w:r>
-          </w:p>
-        </w:tc>
-      </w:tr>
-      <w:tr>
-        <w:tc>
-          <w:tcPr>
-            <w:tcW w:type="dxa" w:w="4320"/>
-          </w:tcPr>
-          <w:p>
-            <w:r>
-              <w:t>`earlyTenureChurn`</w:t>
-            </w:r>
-          </w:p>
-        </w:tc>
-        <w:tc>
-          <w:tcPr>
-            <w:tcW w:type="dxa" w:w="4320"/>
-          </w:tcPr>
-          <w:p>
-            <w:r>
-              <w:t>If `maxWeek - c ≥ 4`: sellers with no stream in weeks `c+1`, `c+2`, `c+3` (new seller / W4 window)</w:t>
-            </w:r>
-          </w:p>
-        </w:tc>
-      </w:tr>
-      <w:tr>
-        <w:tc>
-          <w:tcPr>
-            <w:tcW w:type="dxa" w:w="4320"/>
-          </w:tcPr>
-          <w:p>
-            <w:r>
-              <w:t>`midTenureChurn`</w:t>
-            </w:r>
-          </w:p>
-        </w:tc>
-        <w:tc>
-          <w:tcPr>
-            <w:tcW w:type="dxa" w:w="4320"/>
-          </w:tcPr>
-          <w:p>
-            <w:r>
-              <w:t>If `maxWeek - c ≥ 10`: no stream in weeks `c+7`, `c+8`, `c+9` (growing / W10)</w:t>
-            </w:r>
-          </w:p>
-        </w:tc>
-      </w:tr>
-      <w:tr>
-        <w:tc>
-          <w:tcPr>
-            <w:tcW w:type="dxa" w:w="4320"/>
-          </w:tcPr>
-          <w:p>
-            <w:r>
-              <w:t>`matureTenureChurn`</w:t>
-            </w:r>
-          </w:p>
-        </w:tc>
-        <w:tc>
-          <w:tcPr>
-            <w:tcW w:type="dxa" w:w="4320"/>
-          </w:tcPr>
-          <w:p>
-            <w:r>
-              <w:t>If `maxWeek - c ≥ 16`: no stream in weeks `c+13`, `c+14`, `c+15` (mature / W16)</w:t>
-            </w:r>
-          </w:p>
-        </w:tc>
-      </w:tr>
-    </w:tbl>
-    <w:p/>
-    <w:p>
-      <w:r>
-        <w:t xml:space="preserve">Constants inside </w:t>
-      </w:r>
-      <w:r>
-        <w:rPr>
-          <w:rFonts w:ascii="Courier New" w:hAnsi="Courier New"/>
-          <w:sz w:val="18"/>
-        </w:rPr>
-        <w:t>compute()</w:t>
-      </w:r>
-      <w:r>
-        <w:t>:</w:t>
-      </w:r>
-    </w:p>
-    <w:p>
-      <w:pPr>
-        <w:spacing w:before="120" w:after="120"/>
-        <w:ind w:left="240"/>
-      </w:pPr>
-      <w:r>
-        <w:rPr>
-          <w:rFonts w:ascii="Courier New" w:hAnsi="Courier New"/>
-          <w:sz w:val="18"/>
-        </w:rPr>
-        <w:t>const EARLY_AT = 4, MID_AT = 10, MATURE_AT = 16;</w:t>
-        <w:br/>
-        <w:t>const EXCLUDED_COHORTS = new Set([21, 22, 23, 24]);</w:t>
-      </w:r>
-    </w:p>
-    <w:p>
-      <w:r/>
-      <w:r>
-        <w:rPr>
-          <w:b/>
-        </w:rPr>
-        <w:t>Retention rule:</w:t>
-      </w:r>
-      <w:r>
-        <w:t xml:space="preserve"> Any </w:t>
+        <w:t xml:space="preserve">A seller is </w:t>
       </w:r>
       <w:r>
         <w:rPr>
           <w:b/>
         </w:rPr>
-        <w:t>single stream</w:t>
+        <w:t>retained</w:t>
       </w:r>
       <w:r>
-        <w:t xml:space="preserve"> in the window = retained. No stream in </w:t>
+        <w:t xml:space="preserve"> if they streamed in </w:t>
       </w:r>
       <w:r>
         <w:rPr>
           <w:b/>
         </w:rPr>
-        <w:t>any</w:t>
+        <w:t>at least one</w:t>
       </w:r>
       <w:r>
-        <w:t xml:space="preserve"> week of the window = churned.</w:t>
-      </w:r>
-    </w:p>
-    <w:p>
-      <w:pPr>
-        <w:pStyle w:val="Heading3"/>
-      </w:pPr>
-      <w:r>
-        <w:t>`renderStats(res)` — summary cards</w:t>
+        <w:t xml:space="preserve"> week in that window.</w:t>
       </w:r>
     </w:p>
     <w:p>
       <w:r>
-        <w:t>Location: ~line 422.</w:t>
-      </w:r>
-    </w:p>
-    <w:p>
-      <w:r>
-        <w:t xml:space="preserve">Does </w:t>
+        <w:t xml:space="preserve">Churn is a </w:t>
       </w:r>
       <w:r>
         <w:rPr>
           <w:b/>
         </w:rPr>
-        <w:t>not</w:t>
+        <w:t>point-in-time snapshot</w:t>
       </w:r>
       <w:r>
-        <w:t xml:space="preserve"> recalculate churn windows — aggregates output of </w:t>
-      </w:r>
-      <w:r>
-        <w:rPr>
-          <w:rFonts w:ascii="Courier New" w:hAnsi="Courier New"/>
-          <w:sz w:val="18"/>
-        </w:rPr>
-        <w:t>compute()</w:t>
-      </w:r>
-      <w:r>
-        <w:t>:</w:t>
-      </w:r>
-    </w:p>
-    <w:p>
-      <w:pPr>
-        <w:spacing w:before="120" w:after="120"/>
-        <w:ind w:left="240"/>
-      </w:pPr>
-      <w:r>
-        <w:rPr>
-          <w:rFonts w:ascii="Courier New" w:hAnsi="Courier New"/>
-          <w:sz w:val="18"/>
-        </w:rPr>
-        <w:t>new_seller_churn% = sum(earlyTenureChurn) / sum(cohort sizes where earlyTenureChurn ≠ null) × 100</w:t>
-        <w:br/>
-        <w:t>growing_seller_churn% = sum(midTenureChurn) / sum(eligible sizes) × 100</w:t>
-        <w:br/>
-        <w:t>mature_seller_churn% = sum(matureTenureChurn) / sum(eligible sizes) × 100</w:t>
-        <w:br/>
-        <w:t>total_sellers = sum(cohort sizes across all rows)</w:t>
-      </w:r>
-    </w:p>
-    <w:p>
-      <w:r>
-        <w:t xml:space="preserve">This is a </w:t>
-      </w:r>
-      <w:r>
-        <w:rPr>
-          <w:b/>
-        </w:rPr>
-        <w:t>weighted average</w:t>
-      </w:r>
-      <w:r>
-        <w:t xml:space="preserve"> (not a simple average of cohort percentages).</w:t>
-      </w:r>
-    </w:p>
-    <w:p>
-      <w:pPr>
-        <w:pStyle w:val="Heading3"/>
-      </w:pPr>
-      <w:r>
-        <w:t>`renderTable(res)` — heatmap</w:t>
-      </w:r>
-    </w:p>
-    <w:p>
-      <w:r>
-        <w:t>Location: ~line 464.</w:t>
-      </w:r>
-    </w:p>
-    <w:p>
-      <w:pPr>
-        <w:pStyle w:val="ListBullet"/>
-      </w:pPr>
-      <w:r>
-        <w:t xml:space="preserve">Reads </w:t>
-      </w:r>
-      <w:r>
-        <w:rPr>
-          <w:rFonts w:ascii="Courier New" w:hAnsi="Courier New"/>
-          <w:sz w:val="18"/>
-        </w:rPr>
-        <w:t>r.gapChurn[k]</w:t>
-      </w:r>
-      <w:r>
-        <w:t xml:space="preserve"> and </w:t>
-      </w:r>
-      <w:r>
-        <w:rPr>
-          <w:rFonts w:ascii="Courier New" w:hAnsi="Courier New"/>
-          <w:sz w:val="18"/>
-        </w:rPr>
-        <w:t>r.size</w:t>
-      </w:r>
-      <w:r>
-        <w:t xml:space="preserve"> per cohort row.</w:t>
-      </w:r>
-    </w:p>
-    <w:p>
-      <w:pPr>
-        <w:pStyle w:val="ListBullet"/>
-      </w:pPr>
-      <w:r/>
-      <w:r>
-        <w:rPr>
-          <w:b/>
-        </w:rPr>
-        <w:t>Churn % mode:</w:t>
-      </w:r>
-      <w:r>
-        <w:t xml:space="preserve"> </w:t>
-      </w:r>
-      <w:r>
-        <w:rPr>
-          <w:rFonts w:ascii="Courier New" w:hAnsi="Courier New"/>
-          <w:sz w:val="18"/>
-        </w:rPr>
-        <w:t>gapChurn[k] / size × 100</w:t>
-      </w:r>
-      <w:r/>
-    </w:p>
-    <w:p>
-      <w:pPr>
-        <w:pStyle w:val="ListBullet"/>
-      </w:pPr>
-      <w:r/>
-      <w:r>
-        <w:rPr>
-          <w:b/>
-        </w:rPr>
-        <w:t>Counts mode:</w:t>
-      </w:r>
-      <w:r>
-        <w:t xml:space="preserve"> raw </w:t>
-      </w:r>
-      <w:r>
-        <w:rPr>
-          <w:rFonts w:ascii="Courier New" w:hAnsi="Courier New"/>
-          <w:sz w:val="18"/>
-        </w:rPr>
-        <w:t>gapChurn[k]</w:t>
-      </w:r>
-      <w:r/>
-    </w:p>
-    <w:p>
-      <w:pPr>
-        <w:pStyle w:val="ListBullet"/>
-      </w:pPr>
-      <w:r>
-        <w:t xml:space="preserve">Colors via </w:t>
-      </w:r>
-      <w:r>
-        <w:rPr>
-          <w:rFonts w:ascii="Courier New" w:hAnsi="Courier New"/>
-          <w:sz w:val="18"/>
-        </w:rPr>
-        <w:t>heatStyle(1 - ratio)</w:t>
-      </w:r>
-      <w:r>
-        <w:t xml:space="preserve"> (green = low churn, red = high)</w:t>
-      </w:r>
-    </w:p>
-    <w:p>
-      <w:pPr>
-        <w:pStyle w:val="Heading3"/>
-      </w:pPr>
-      <w:r>
-        <w:t>`renderChart(res)` — line chart</w:t>
-      </w:r>
-    </w:p>
-    <w:p>
-      <w:r>
-        <w:t>Location: ~line 506.</w:t>
-      </w:r>
-    </w:p>
-    <w:p>
-      <w:r>
-        <w:t xml:space="preserve">Per cohort, plots </w:t>
-      </w:r>
-      <w:r>
-        <w:rPr>
-          <w:b/>
-        </w:rPr>
-        <w:t>unweighted</w:t>
-      </w:r>
-      <w:r>
-        <w:t xml:space="preserve"> cohort churn %:</w:t>
-      </w:r>
-    </w:p>
-    <w:p>
-      <w:pPr>
-        <w:pStyle w:val="ListBullet"/>
-      </w:pPr>
-      <w:r>
-        <w:t xml:space="preserve">Blue: </w:t>
-      </w:r>
-      <w:r>
-        <w:rPr>
-          <w:rFonts w:ascii="Courier New" w:hAnsi="Courier New"/>
-          <w:sz w:val="18"/>
-        </w:rPr>
-        <w:t>earlyTenureChurn / size</w:t>
-      </w:r>
-      <w:r>
-        <w:t xml:space="preserve"> at W4 (if eligible)</w:t>
-      </w:r>
-    </w:p>
-    <w:p>
-      <w:pPr>
-        <w:pStyle w:val="ListBullet"/>
-      </w:pPr>
-      <w:r>
-        <w:t xml:space="preserve">Yellow: </w:t>
-      </w:r>
-      <w:r>
-        <w:rPr>
-          <w:rFonts w:ascii="Courier New" w:hAnsi="Courier New"/>
-          <w:sz w:val="18"/>
-        </w:rPr>
-        <w:t>midTenureChurn / size</w:t>
-      </w:r>
-      <w:r>
-        <w:t xml:space="preserve"> at W10</w:t>
-      </w:r>
-    </w:p>
-    <w:p>
-      <w:pPr>
-        <w:pStyle w:val="ListBullet"/>
-      </w:pPr>
-      <w:r>
-        <w:t xml:space="preserve">Red: </w:t>
-      </w:r>
-      <w:r>
-        <w:rPr>
-          <w:rFonts w:ascii="Courier New" w:hAnsi="Courier New"/>
-          <w:sz w:val="18"/>
-        </w:rPr>
-        <w:t>matureTenureChurn / size</w:t>
-      </w:r>
-      <w:r>
-        <w:t xml:space="preserve"> at W16</w:t>
-      </w:r>
-    </w:p>
-    <w:p>
-      <w:r>
-        <w:t>Lines stop where cohorts lack follow-up (mature line only through early cohorts).</w:t>
-      </w:r>
-    </w:p>
-    <w:p>
-      <w:pPr>
-        <w:pStyle w:val="Heading3"/>
-      </w:pPr>
-      <w:r>
-        <w:t>Other dashboard JS (UI only — no churn math)</w:t>
-      </w:r>
-    </w:p>
-    <w:tbl>
-      <w:tblPr>
-        <w:tblStyle w:val="TableGrid"/>
-        <w:tblW w:type="auto" w:w="0"/>
-        <w:tblLook w:firstColumn="1" w:firstRow="1" w:lastColumn="0" w:lastRow="0" w:noHBand="0" w:noVBand="1" w:val="04A0"/>
-      </w:tblPr>
-      <w:tblGrid>
-        <w:gridCol w:w="4320"/>
-        <w:gridCol w:w="4320"/>
-      </w:tblGrid>
-      <w:tr>
-        <w:tc>
-          <w:tcPr>
-            <w:tcW w:type="dxa" w:w="4320"/>
-            <w:shd w:fill="E8EEF4" w:val="clear"/>
-          </w:tcPr>
-          <w:p>
-            <w:r>
-              <w:rPr>
-                <w:b/>
-              </w:rPr>
-              <w:t>Function</w:t>
-            </w:r>
-          </w:p>
-        </w:tc>
-        <w:tc>
-          <w:tcPr>
-            <w:tcW w:type="dxa" w:w="4320"/>
-            <w:shd w:fill="E8EEF4" w:val="clear"/>
-          </w:tcPr>
-          <w:p>
-            <w:r>
-              <w:rPr>
-                <w:b/>
-              </w:rPr>
-              <w:t>Role</w:t>
-            </w:r>
-          </w:p>
-        </w:tc>
-      </w:tr>
-      <w:tr>
-        <w:tc>
-          <w:tcPr>
-            <w:tcW w:type="dxa" w:w="4320"/>
-          </w:tcPr>
-          <w:p>
-            <w:r>
-              <w:t>`optionsFor()`</w:t>
-            </w:r>
-          </w:p>
-        </w:tc>
-        <w:tc>
-          <w:tcPr>
-            <w:tcW w:type="dxa" w:w="4320"/>
-          </w:tcPr>
-          <w:p>
-            <w:r>
-              <w:t>Country dropdown options (excludes "Other Countries")</w:t>
-            </w:r>
-          </w:p>
-        </w:tc>
-      </w:tr>
-      <w:tr>
-        <w:tc>
-          <w:tcPr>
-            <w:tcW w:type="dxa" w:w="4320"/>
-          </w:tcPr>
-          <w:p>
-            <w:r>
-              <w:t>`cohortLabel()`, `RW_DATES`</w:t>
-            </w:r>
-          </w:p>
-        </w:tc>
-        <w:tc>
-          <w:tcPr>
-            <w:tcW w:type="dxa" w:w="4320"/>
-          </w:tcPr>
-          <w:p>
-            <w:r>
-              <w:t>Cohort row labels with calendar dates</w:t>
-            </w:r>
-          </w:p>
-        </w:tc>
-      </w:tr>
-      <w:tr>
-        <w:tc>
-          <w:tcPr>
-            <w:tcW w:type="dxa" w:w="4320"/>
-          </w:tcPr>
-          <w:p>
-            <w:r>
-              <w:t>`buildFilter()`</w:t>
-            </w:r>
-          </w:p>
-        </w:tc>
-        <w:tc>
-          <w:tcPr>
-            <w:tcW w:type="dxa" w:w="4320"/>
-          </w:tcPr>
-          <w:p>
-            <w:r>
-              <w:t>Multi-select filter UI</w:t>
-            </w:r>
-          </w:p>
-        </w:tc>
-      </w:tr>
-      <w:tr>
-        <w:tc>
-          <w:tcPr>
-            <w:tcW w:type="dxa" w:w="4320"/>
-          </w:tcPr>
-          <w:p>
-            <w:r>
-              <w:t>`heatStyle()`</w:t>
-            </w:r>
-          </w:p>
-        </w:tc>
-        <w:tc>
-          <w:tcPr>
-            <w:tcW w:type="dxa" w:w="4320"/>
-          </w:tcPr>
-          <w:p>
-            <w:r>
-              <w:t>Heatmap cell colors</w:t>
-            </w:r>
-          </w:p>
-        </w:tc>
-      </w:tr>
-    </w:tbl>
-    <w:p/>
-    <w:p>
-      <w:pPr>
-        <w:pStyle w:val="Heading3"/>
-      </w:pPr>
-      <w:r>
-        <w:t>`dashboard/live_seller_churn_dashboard_20260617.html`</w:t>
-      </w:r>
-    </w:p>
-    <w:p>
-      <w:r>
-        <w:t xml:space="preserve">Older dashboard version. </w:t>
-      </w:r>
-      <w:r>
-        <w:rPr>
-          <w:b/>
-        </w:rPr>
-        <w:t>Do not use for current churn definitions.</w:t>
-      </w:r>
-      <w:r>
-        <w:t xml:space="preserve"> Summary cards used different averaging logic. Kept for history.</w:t>
-      </w:r>
-    </w:p>
-    <w:p/>
-    <w:p>
-      <w:pPr>
-        <w:pStyle w:val="Heading2"/>
-      </w:pPr>
-      <w:r>
-        <w:t>Scripts — build pipeline</w:t>
-      </w:r>
-    </w:p>
-    <w:p>
-      <w:pPr>
-        <w:pStyle w:val="Heading3"/>
-      </w:pPr>
-      <w:r>
-        <w:t>`scripts/build_canvas.py`</w:t>
-      </w:r>
-    </w:p>
-    <w:p>
-      <w:r/>
-      <w:r>
-        <w:rPr>
-          <w:b/>
-        </w:rPr>
-        <w:t>Role:</w:t>
-      </w:r>
-      <w:r>
-        <w:t xml:space="preserve"> ETL only. </w:t>
-      </w:r>
-      <w:r>
-        <w:rPr>
-          <w:b/>
-        </w:rPr>
-        <w:t>Does not calculate churn.</w:t>
-      </w:r>
-      <w:r/>
-    </w:p>
-    <w:tbl>
-      <w:tblPr>
-        <w:tblStyle w:val="TableGrid"/>
-        <w:tblW w:type="auto" w:w="0"/>
-        <w:tblLook w:firstColumn="1" w:firstRow="1" w:lastColumn="0" w:lastRow="0" w:noHBand="0" w:noVBand="1" w:val="04A0"/>
-      </w:tblPr>
-      <w:tblGrid>
-        <w:gridCol w:w="4320"/>
-        <w:gridCol w:w="4320"/>
-      </w:tblGrid>
-      <w:tr>
-        <w:tc>
-          <w:tcPr>
-            <w:tcW w:type="dxa" w:w="4320"/>
-            <w:shd w:fill="E8EEF4" w:val="clear"/>
-          </w:tcPr>
-          <w:p>
-            <w:r>
-              <w:rPr>
-                <w:b/>
-              </w:rPr>
-              <w:t>Step</w:t>
-            </w:r>
-          </w:p>
-        </w:tc>
-        <w:tc>
-          <w:tcPr>
-            <w:tcW w:type="dxa" w:w="4320"/>
-            <w:shd w:fill="E8EEF4" w:val="clear"/>
-          </w:tcPr>
-          <w:p>
-            <w:r>
-              <w:rPr>
-                <w:b/>
-              </w:rPr>
-              <w:t>Action</w:t>
-            </w:r>
-          </w:p>
-        </w:tc>
-      </w:tr>
-      <w:tr>
-        <w:tc>
-          <w:tcPr>
-            <w:tcW w:type="dxa" w:w="4320"/>
-          </w:tcPr>
-          <w:p>
-            <w:r>
-              <w:t>Read</w:t>
-            </w:r>
-          </w:p>
-        </w:tc>
-        <w:tc>
-          <w:tcPr>
-            <w:tcW w:type="dxa" w:w="4320"/>
-          </w:tcPr>
-          <w:p>
-            <w:r>
-              <w:t>`data/raw/streams_first_stream_2026.csv`</w:t>
-            </w:r>
-          </w:p>
-        </w:tc>
-      </w:tr>
-      <w:tr>
-        <w:tc>
-          <w:tcPr>
-            <w:tcW w:type="dxa" w:w="4320"/>
-          </w:tcPr>
-          <w:p>
-            <w:r>
-              <w:t>Group</w:t>
-            </w:r>
-          </w:p>
-        </w:tc>
-        <w:tc>
-          <w:tcPr>
-            <w:tcW w:type="dxa" w:w="4320"/>
-          </w:tcPr>
-          <w:p>
-            <w:r>
-              <w:t>By `SLR_ID`, collect all `(RETAIL_WEEK, vertical)` pairs</w:t>
-            </w:r>
-          </w:p>
-        </w:tc>
-      </w:tr>
-      <w:tr>
-        <w:tc>
-          <w:tcPr>
-            <w:tcW w:type="dxa" w:w="4320"/>
-          </w:tcPr>
-          <w:p>
-            <w:r>
-              <w:t>Write</w:t>
-            </w:r>
-          </w:p>
-        </w:tc>
-        <w:tc>
-          <w:tcPr>
-            <w:tcW w:type="dxa" w:w="4320"/>
-          </w:tcPr>
-          <w:p>
-            <w:r>
-              <w:t>`data/processed/canvas_data.json`</w:t>
-            </w:r>
-          </w:p>
-        </w:tc>
-      </w:tr>
-      <w:tr>
-        <w:tc>
-          <w:tcPr>
-            <w:tcW w:type="dxa" w:w="4320"/>
-          </w:tcPr>
-          <w:p>
-            <w:r>
-              <w:t>Print</w:t>
-            </w:r>
-          </w:p>
-        </w:tc>
-        <w:tc>
-          <w:tcPr>
-            <w:tcW w:type="dxa" w:w="4320"/>
-          </w:tcPr>
-          <w:p>
-            <w:r>
-              <w:t>Sanity-check cohort matrix (active in last week — informational, not used in dashboard)</w:t>
-            </w:r>
-          </w:p>
-        </w:tc>
-      </w:tr>
-    </w:tbl>
-    <w:p/>
-    <w:p>
-      <w:r>
-        <w:t xml:space="preserve">Paths are resolved relative to repo root via </w:t>
-      </w:r>
-      <w:r>
-        <w:rPr>
-          <w:rFonts w:ascii="Courier New" w:hAnsi="Courier New"/>
-          <w:sz w:val="18"/>
-        </w:rPr>
-        <w:t>Path(__file__).parent.parent</w:t>
-      </w:r>
-      <w:r>
-        <w:t>.</w:t>
-      </w:r>
-    </w:p>
-    <w:p>
-      <w:pPr>
-        <w:spacing w:before="120" w:after="120"/>
-        <w:ind w:left="240"/>
-      </w:pPr>
-      <w:r>
-        <w:rPr>
-          <w:rFonts w:ascii="Courier New" w:hAnsi="Courier New"/>
-          <w:sz w:val="18"/>
-        </w:rPr>
-        <w:t>python scripts/build_canvas.py</w:t>
-      </w:r>
-    </w:p>
-    <w:p>
-      <w:r>
-        <w:t xml:space="preserve">After running, you must still </w:t>
-      </w:r>
-      <w:r>
-        <w:rPr>
-          <w:b/>
-        </w:rPr>
-        <w:t>re-embed</w:t>
-      </w:r>
-      <w:r>
-        <w:t xml:space="preserve"> JSON into the HTML </w:t>
-      </w:r>
-      <w:r>
-        <w:rPr>
-          <w:rFonts w:ascii="Courier New" w:hAnsi="Courier New"/>
-          <w:sz w:val="18"/>
-        </w:rPr>
-        <w:t>const DATA</w:t>
-      </w:r>
-      <w:r>
-        <w:t xml:space="preserve"> block if you want the dashboard file itself updated.</w:t>
-      </w:r>
-    </w:p>
-    <w:p>
-      <w:pPr>
-        <w:pStyle w:val="Heading3"/>
-      </w:pPr>
-      <w:r>
-        <w:t>`scripts/build_html.py`</w:t>
-      </w:r>
-    </w:p>
-    <w:p>
-      <w:r/>
-      <w:r>
-        <w:rPr>
-          <w:b/>
-        </w:rPr>
-        <w:t>Role:</w:t>
-      </w:r>
-      <w:r>
-        <w:t xml:space="preserve"> Legacy builder for an </w:t>
-      </w:r>
-      <w:r>
-        <w:rPr>
-          <w:b/>
-        </w:rPr>
-        <w:t>older retention dashboard</w:t>
-      </w:r>
-      <w:r>
-        <w:t xml:space="preserve"> (</w:t>
-      </w:r>
-      <w:r>
-        <w:rPr>
-          <w:rFonts w:ascii="Courier New" w:hAnsi="Courier New"/>
-          <w:sz w:val="18"/>
-        </w:rPr>
-        <w:t>dashboard/cohort_retention_dashboard.html</w:t>
-      </w:r>
-      <w:r>
-        <w:t xml:space="preserve"> when generated).</w:t>
-      </w:r>
-    </w:p>
-    <w:p>
-      <w:r/>
-      <w:r>
-        <w:rPr>
-          <w:b/>
-        </w:rPr>
-        <w:t>Uses a different churn definition:</w:t>
-      </w:r>
-      <w:r/>
-    </w:p>
-    <w:p>
-      <w:pPr>
-        <w:pStyle w:val="ListBullet"/>
-      </w:pPr>
-      <w:r/>
-      <w:r>
-        <w:rPr>
-          <w:rFonts w:ascii="Courier New" w:hAnsi="Courier New"/>
-          <w:sz w:val="18"/>
-        </w:rPr>
-        <w:t>churned = cohort_size - active_in_maxWeek</w:t>
-      </w:r>
-      <w:r/>
-    </w:p>
-    <w:p>
-      <w:pPr>
-        <w:pStyle w:val="ListBullet"/>
-      </w:pPr>
-      <w:r>
-        <w:t>Not tenure-window churn (W1–W3, W7–W9, etc.)</w:t>
-      </w:r>
-    </w:p>
-    <w:p>
-      <w:r/>
-      <w:r>
-        <w:rPr>
-          <w:b/>
-        </w:rPr>
-        <w:t>Not used</w:t>
-      </w:r>
-      <w:r>
-        <w:t xml:space="preserve"> by </w:t>
-      </w:r>
-      <w:r>
-        <w:rPr>
-          <w:rFonts w:ascii="Courier New" w:hAnsi="Courier New"/>
-          <w:sz w:val="18"/>
-        </w:rPr>
-        <w:t>live_seller_churn_dashboard_20260618.html</w:t>
-      </w:r>
-      <w:r>
-        <w:t>.</w:t>
-      </w:r>
-    </w:p>
-    <w:p/>
-    <w:p>
-      <w:pPr>
-        <w:pStyle w:val="Heading2"/>
-      </w:pPr>
-      <w:r>
-        <w:t>Tools — development / validation</w:t>
-      </w:r>
-    </w:p>
-    <w:p>
-      <w:pPr>
-        <w:pStyle w:val="Heading3"/>
-      </w:pPr>
-      <w:r>
-        <w:t>`tools/check.js`</w:t>
-      </w:r>
-    </w:p>
-    <w:p>
-      <w:r>
-        <w:t xml:space="preserve">Large JS file containing a </w:t>
-      </w:r>
-      <w:r>
-        <w:rPr>
-          <w:b/>
-        </w:rPr>
-        <w:t>mirror</w:t>
-      </w:r>
-      <w:r>
-        <w:t xml:space="preserve"> of the dashboard’s </w:t>
-      </w:r>
-      <w:r>
-        <w:rPr>
-          <w:rFonts w:ascii="Courier New" w:hAnsi="Courier New"/>
-          <w:sz w:val="18"/>
-        </w:rPr>
-        <w:t>DATA</w:t>
-      </w:r>
-      <w:r>
-        <w:t xml:space="preserve"> + </w:t>
-      </w:r>
-      <w:r>
-        <w:rPr>
-          <w:rFonts w:ascii="Courier New" w:hAnsi="Courier New"/>
-          <w:sz w:val="18"/>
-        </w:rPr>
-        <w:t>compute()</w:t>
-      </w:r>
-      <w:r>
-        <w:t xml:space="preserve"> + related functions (copied from an earlier HTML version for headless testing).</w:t>
-      </w:r>
-    </w:p>
-    <w:p>
-      <w:r/>
-      <w:r>
-        <w:rPr>
-          <w:b/>
-        </w:rPr>
-        <w:t>Use when:</w:t>
-      </w:r>
-      <w:r>
-        <w:t xml:space="preserve"> Verifying that changes to churn logic still produce expected cohort counts.</w:t>
-      </w:r>
-    </w:p>
-    <w:p>
-      <w:pPr>
-        <w:pStyle w:val="Heading3"/>
-      </w:pPr>
-      <w:r>
-        <w:t>`tools/harness.js`</w:t>
-      </w:r>
-    </w:p>
-    <w:p>
-      <w:r>
-        <w:t>Minimal runner:</w:t>
-      </w:r>
-    </w:p>
-    <w:p>
-      <w:pPr>
-        <w:spacing w:before="120" w:after="120"/>
-        <w:ind w:left="240"/>
-      </w:pPr>
-      <w:r>
-        <w:rPr>
-          <w:rFonts w:ascii="Courier New" w:hAnsi="Courier New"/>
-          <w:sz w:val="18"/>
-        </w:rPr>
-        <w:t>cd tools &amp;&amp; node harness.js</w:t>
-      </w:r>
-    </w:p>
-    <w:p>
-      <w:r>
-        <w:t xml:space="preserve">Loads </w:t>
-      </w:r>
-      <w:r>
-        <w:rPr>
-          <w:rFonts w:ascii="Courier New" w:hAnsi="Courier New"/>
-          <w:sz w:val="18"/>
-        </w:rPr>
-        <w:t>check.js</w:t>
-      </w:r>
-      <w:r>
-        <w:t xml:space="preserve">, runs </w:t>
-      </w:r>
-      <w:r>
-        <w:rPr>
-          <w:rFonts w:ascii="Courier New" w:hAnsi="Courier New"/>
-          <w:sz w:val="18"/>
-        </w:rPr>
-        <w:t>compute()</w:t>
-      </w:r>
-      <w:r>
-        <w:t xml:space="preserve">, prints cohort list, onboard total, and </w:t>
-      </w:r>
-      <w:r>
-        <w:rPr>
-          <w:rFonts w:ascii="Courier New" w:hAnsi="Courier New"/>
-          <w:sz w:val="18"/>
-        </w:rPr>
-        <w:t>maxWeek</w:t>
-      </w:r>
-      <w:r>
-        <w:t>.</w:t>
-      </w:r>
-    </w:p>
-    <w:p/>
-    <w:p>
-      <w:pPr>
-        <w:pStyle w:val="Heading1"/>
-      </w:pPr>
-      <w:r>
-        <w:t>Seller cohorts (2026)</w:t>
-      </w:r>
-    </w:p>
-    <w:p>
-      <w:pPr>
-        <w:pStyle w:val="Heading2"/>
-      </w:pPr>
-      <w:r>
-        <w:t>Definition</w:t>
-      </w:r>
-    </w:p>
-    <w:p>
-      <w:r/>
-      <w:r>
-        <w:rPr>
-          <w:b/>
-        </w:rPr>
-        <w:t>Cohort</w:t>
-      </w:r>
-      <w:r>
-        <w:t xml:space="preserve"> = retail week of a seller’s </w:t>
-      </w:r>
-      <w:r>
-        <w:rPr>
-          <w:b/>
-        </w:rPr>
-        <w:t>first Live stream</w:t>
-      </w:r>
-      <w:r>
-        <w:t xml:space="preserve"> in 2026.</w:t>
-      </w:r>
-    </w:p>
-    <w:p>
-      <w:pPr>
-        <w:pStyle w:val="ListBullet"/>
-      </w:pPr>
-      <w:r>
-        <w:t xml:space="preserve">Label: </w:t>
-      </w:r>
-      <w:r>
-        <w:rPr>
-          <w:rFonts w:ascii="Courier New" w:hAnsi="Courier New"/>
-          <w:sz w:val="18"/>
-        </w:rPr>
-        <w:t>26RW01</w:t>
-      </w:r>
-      <w:r>
-        <w:t xml:space="preserve"> … </w:t>
-      </w:r>
-      <w:r>
-        <w:rPr>
-          <w:rFonts w:ascii="Courier New" w:hAnsi="Courier New"/>
-          <w:sz w:val="18"/>
-        </w:rPr>
-        <w:t>26RW24</w:t>
-      </w:r>
-      <w:r/>
-    </w:p>
-    <w:p>
-      <w:pPr>
-        <w:pStyle w:val="ListBullet"/>
-      </w:pPr>
-      <w:r>
-        <w:t xml:space="preserve">Assignment: </w:t>
-      </w:r>
-      <w:r>
-        <w:rPr>
-          <w:rFonts w:ascii="Courier New" w:hAnsi="Courier New"/>
-          <w:sz w:val="18"/>
-        </w:rPr>
-        <w:t>cohort = min(retail_week)</w:t>
-      </w:r>
-      <w:r>
-        <w:t xml:space="preserve"> across all stream rows for </w:t>
-      </w:r>
-      <w:r>
-        <w:rPr>
-          <w:rFonts w:ascii="Courier New" w:hAnsi="Courier New"/>
-          <w:sz w:val="18"/>
-        </w:rPr>
-        <w:t>SLR_ID</w:t>
-      </w:r>
-      <w:r/>
-    </w:p>
-    <w:p>
-      <w:pPr>
-        <w:pStyle w:val="ListBullet"/>
-      </w:pPr>
-      <w:r/>
-      <w:r>
-        <w:rPr>
-          <w:b/>
-        </w:rPr>
-        <w:t>One seller → one cohort</w:t>
-      </w:r>
-      <w:r>
-        <w:t xml:space="preserve"> (never double-counted across rows)</w:t>
-      </w:r>
-    </w:p>
-    <w:p>
-      <w:pPr>
-        <w:pStyle w:val="Heading2"/>
-      </w:pPr>
-      <w:r>
-        <w:t>Population (current extract)</w:t>
-      </w:r>
-    </w:p>
-    <w:p>
-      <w:pPr>
-        <w:pStyle w:val="ListBullet"/>
-      </w:pPr>
-      <w:r>
-        <w:t>~</w:t>
-      </w:r>
-      <w:r>
-        <w:rPr>
-          <w:b/>
-        </w:rPr>
-        <w:t>2,570</w:t>
-      </w:r>
-      <w:r>
-        <w:t xml:space="preserve"> sellers</w:t>
-      </w:r>
-    </w:p>
-    <w:p>
-      <w:pPr>
-        <w:pStyle w:val="ListBullet"/>
-      </w:pPr>
-      <w:r>
-        <w:t xml:space="preserve">Retail weeks </w:t>
-      </w:r>
-      <w:r>
-        <w:rPr>
-          <w:b/>
-        </w:rPr>
-        <w:t>1–24</w:t>
-      </w:r>
-      <w:r>
-        <w:t xml:space="preserve"> in data</w:t>
-      </w:r>
-    </w:p>
-    <w:p>
-      <w:pPr>
-        <w:pStyle w:val="ListBullet"/>
-      </w:pPr>
-      <w:r>
-        <w:t xml:space="preserve">Cohorts </w:t>
-      </w:r>
-      <w:r>
-        <w:rPr>
-          <w:b/>
-        </w:rPr>
-        <w:t>21–24</w:t>
-      </w:r>
-      <w:r>
-        <w:t xml:space="preserve"> hidden in UI (not enough tenure for fair comparison)</w:t>
-      </w:r>
-    </w:p>
-    <w:p>
-      <w:pPr>
-        <w:pStyle w:val="ListBullet"/>
-      </w:pPr>
-      <w:r>
-        <w:t>Countries: UK, IT, US, DE, FR, AU, CA, Other Countries (Other Countries omitted from filter dropdown but included in default “All” view)</w:t>
+        <w:t xml:space="preserve"> per column or card. If a seller streams again within the window, they count as retained for that measurement.</w:t>
       </w:r>
     </w:p>
     <w:p>
@@ -2732,7 +162,25 @@
     </w:p>
     <w:p>
       <w:r>
-        <w:t xml:space="preserve">If cohort retail week is </w:t>
+        <w:t xml:space="preserve">Sellers are grouped into </w:t>
+      </w:r>
+      <w:r>
+        <w:rPr>
+          <w:b/>
+        </w:rPr>
+        <w:t>cohorts</w:t>
+      </w:r>
+      <w:r>
+        <w:t xml:space="preserve"> by the </w:t>
+      </w:r>
+      <w:r>
+        <w:rPr>
+          <w:b/>
+        </w:rPr>
+        <w:t>2026 retail week of their first Live stream</w:t>
+      </w:r>
+      <w:r>
+        <w:t xml:space="preserve"> (cohort week </w:t>
       </w:r>
       <w:r>
         <w:rPr>
@@ -2742,7 +190,7 @@
         <w:t>c</w:t>
       </w:r>
       <w:r>
-        <w:t>:</w:t>
+        <w:t>).</w:t>
       </w:r>
     </w:p>
     <w:tbl>
@@ -2802,7 +250,7 @@
           </w:tcPr>
           <w:p>
             <w:r>
-              <w:t>`c + 1`</w:t>
+              <w:t>c + 1</w:t>
             </w:r>
           </w:p>
         </w:tc>
@@ -2814,7 +262,7 @@
           </w:tcPr>
           <w:p>
             <w:r>
-              <w:t>W4</w:t>
+              <w:t>Wk</w:t>
             </w:r>
           </w:p>
         </w:tc>
@@ -2824,51 +272,7 @@
           </w:tcPr>
           <w:p>
             <w:r>
-              <w:t>`c + 4`</w:t>
-            </w:r>
-          </w:p>
-        </w:tc>
-      </w:tr>
-      <w:tr>
-        <w:tc>
-          <w:tcPr>
-            <w:tcW w:type="dxa" w:w="4320"/>
-          </w:tcPr>
-          <w:p>
-            <w:r>
-              <w:t>W10</w:t>
-            </w:r>
-          </w:p>
-        </w:tc>
-        <w:tc>
-          <w:tcPr>
-            <w:tcW w:type="dxa" w:w="4320"/>
-          </w:tcPr>
-          <w:p>
-            <w:r>
-              <w:t>`c + 10`</w:t>
-            </w:r>
-          </w:p>
-        </w:tc>
-      </w:tr>
-      <w:tr>
-        <w:tc>
-          <w:tcPr>
-            <w:tcW w:type="dxa" w:w="4320"/>
-          </w:tcPr>
-          <w:p>
-            <w:r>
-              <w:t>W16</w:t>
-            </w:r>
-          </w:p>
-        </w:tc>
-        <w:tc>
-          <w:tcPr>
-            <w:tcW w:type="dxa" w:w="4320"/>
-          </w:tcPr>
-          <w:p>
-            <w:r>
-              <w:t>`c + 16`</w:t>
+              <w:t>c + k</w:t>
             </w:r>
           </w:p>
         </w:tc>
@@ -2877,16 +281,17 @@
     <w:p/>
     <w:p>
       <w:r>
-        <w:t>Approximate calendar tenure: W4 ≈ 1 month, W10 ≈ 2.5 months, W16 ≈ 4 months after first stream week.</w:t>
+        <w:t>Example: cohort 26RW05 (</w:t>
       </w:r>
-    </w:p>
-    <w:p/>
-    <w:p>
-      <w:pPr>
-        <w:pStyle w:val="Heading1"/>
-      </w:pPr>
       <w:r>
-        <w:t>Churn definitions (complete)</w:t>
+        <w:rPr>
+          <w:rFonts w:ascii="Courier New" w:hAnsi="Courier New"/>
+          <w:sz w:val="18"/>
+        </w:rPr>
+        <w:t>c = 5</w:t>
+      </w:r>
+      <w:r>
+        <w:t>) → W7 is retail week 12.</w:t>
       </w:r>
     </w:p>
     <w:p>
@@ -2894,7 +299,31 @@
         <w:pStyle w:val="Heading2"/>
       </w:pPr>
       <w:r>
-        <w:t>Summary cards</w:t>
+        <w:t>Three summary-card churn metrics (weighted averages)</w:t>
+      </w:r>
+    </w:p>
+    <w:p>
+      <w:r>
+        <w:t xml:space="preserve">Cards show </w:t>
+      </w:r>
+      <w:r>
+        <w:rPr>
+          <w:b/>
+        </w:rPr>
+        <w:t>weighted</w:t>
+      </w:r>
+      <w:r>
+        <w:t xml:space="preserve"> churn: </w:t>
+      </w:r>
+      <w:r>
+        <w:rPr>
+          <w:rFonts w:ascii="Courier New" w:hAnsi="Courier New"/>
+          <w:sz w:val="18"/>
+        </w:rPr>
+        <w:t>sum(churned sellers) ÷ sum(starters) × 100</w:t>
+      </w:r>
+      <w:r>
+        <w:t xml:space="preserve"> across eligible cohorts (not a simple average of cohort %).</w:t>
       </w:r>
     </w:p>
     <w:tbl>
@@ -2904,15 +333,16 @@
         <w:tblLook w:firstColumn="1" w:firstRow="1" w:lastColumn="0" w:lastRow="0" w:noHBand="0" w:noVBand="1" w:val="04A0"/>
       </w:tblPr>
       <w:tblGrid>
-        <w:gridCol w:w="2160"/>
-        <w:gridCol w:w="2160"/>
-        <w:gridCol w:w="2160"/>
-        <w:gridCol w:w="2160"/>
+        <w:gridCol w:w="1728"/>
+        <w:gridCol w:w="1728"/>
+        <w:gridCol w:w="1728"/>
+        <w:gridCol w:w="1728"/>
+        <w:gridCol w:w="1728"/>
       </w:tblGrid>
       <w:tr>
         <w:tc>
           <w:tcPr>
-            <w:tcW w:type="dxa" w:w="2160"/>
+            <w:tcW w:type="dxa" w:w="1728"/>
             <w:shd w:fill="E8EEF4" w:val="clear"/>
           </w:tcPr>
           <w:p>
@@ -2926,7 +356,7 @@
         </w:tc>
         <w:tc>
           <w:tcPr>
-            <w:tcW w:type="dxa" w:w="2160"/>
+            <w:tcW w:type="dxa" w:w="1728"/>
             <w:shd w:fill="E8EEF4" w:val="clear"/>
           </w:tcPr>
           <w:p>
@@ -2940,7 +370,7 @@
         </w:tc>
         <w:tc>
           <w:tcPr>
-            <w:tcW w:type="dxa" w:w="2160"/>
+            <w:tcW w:type="dxa" w:w="1728"/>
             <w:shd w:fill="E8EEF4" w:val="clear"/>
           </w:tcPr>
           <w:p>
@@ -2948,13 +378,13 @@
               <w:rPr>
                 <w:b/>
               </w:rPr>
-              <w:t>Churned if NO stream in</w:t>
+              <w:t>Churned = no stream in</w:t>
             </w:r>
           </w:p>
         </w:tc>
         <w:tc>
           <w:tcPr>
-            <w:tcW w:type="dxa" w:w="2160"/>
+            <w:tcW w:type="dxa" w:w="1728"/>
             <w:shd w:fill="E8EEF4" w:val="clear"/>
           </w:tcPr>
           <w:p>
@@ -2962,7 +392,21 @@
               <w:rPr>
                 <w:b/>
               </w:rPr>
-              <w:t>Eligibility</w:t>
+              <w:t>~Tenure</w:t>
+            </w:r>
+          </w:p>
+        </w:tc>
+        <w:tc>
+          <w:tcPr>
+            <w:tcW w:type="dxa" w:w="1728"/>
+            <w:shd w:fill="E8EEF4" w:val="clear"/>
+          </w:tcPr>
+          <w:p>
+            <w:r>
+              <w:rPr>
+                <w:b/>
+              </w:rPr>
+              <w:t>Eligible when</w:t>
             </w:r>
           </w:p>
         </w:tc>
@@ -2970,17 +414,17 @@
       <w:tr>
         <w:tc>
           <w:tcPr>
-            <w:tcW w:type="dxa" w:w="2160"/>
+            <w:tcW w:type="dxa" w:w="1728"/>
           </w:tcPr>
           <w:p>
             <w:r>
-              <w:t>New seller</w:t>
+              <w:t>New seller churn</w:t>
             </w:r>
           </w:p>
         </w:tc>
         <w:tc>
           <w:tcPr>
-            <w:tcW w:type="dxa" w:w="2160"/>
+            <w:tcW w:type="dxa" w:w="1728"/>
           </w:tcPr>
           <w:p>
             <w:r>
@@ -2990,7 +434,7 @@
         </w:tc>
         <w:tc>
           <w:tcPr>
-            <w:tcW w:type="dxa" w:w="2160"/>
+            <w:tcW w:type="dxa" w:w="1728"/>
           </w:tcPr>
           <w:p>
             <w:r>
@@ -3000,7 +444,17 @@
         </w:tc>
         <w:tc>
           <w:tcPr>
-            <w:tcW w:type="dxa" w:w="2160"/>
+            <w:tcW w:type="dxa" w:w="1728"/>
+          </w:tcPr>
+          <w:p>
+            <w:r>
+              <w:t>~1 month</w:t>
+            </w:r>
+          </w:p>
+        </w:tc>
+        <w:tc>
+          <w:tcPr>
+            <w:tcW w:type="dxa" w:w="1728"/>
           </w:tcPr>
           <w:p>
             <w:r>
@@ -3012,17 +466,17 @@
       <w:tr>
         <w:tc>
           <w:tcPr>
-            <w:tcW w:type="dxa" w:w="2160"/>
+            <w:tcW w:type="dxa" w:w="1728"/>
           </w:tcPr>
           <w:p>
             <w:r>
-              <w:t>Growing seller</w:t>
+              <w:t>Growing seller churn</w:t>
             </w:r>
           </w:p>
         </w:tc>
         <w:tc>
           <w:tcPr>
-            <w:tcW w:type="dxa" w:w="2160"/>
+            <w:tcW w:type="dxa" w:w="1728"/>
           </w:tcPr>
           <w:p>
             <w:r>
@@ -3032,7 +486,7 @@
         </w:tc>
         <w:tc>
           <w:tcPr>
-            <w:tcW w:type="dxa" w:w="2160"/>
+            <w:tcW w:type="dxa" w:w="1728"/>
           </w:tcPr>
           <w:p>
             <w:r>
@@ -3042,7 +496,17 @@
         </w:tc>
         <w:tc>
           <w:tcPr>
-            <w:tcW w:type="dxa" w:w="2160"/>
+            <w:tcW w:type="dxa" w:w="1728"/>
+          </w:tcPr>
+          <w:p>
+            <w:r>
+              <w:t>~2.5 months</w:t>
+            </w:r>
+          </w:p>
+        </w:tc>
+        <w:tc>
+          <w:tcPr>
+            <w:tcW w:type="dxa" w:w="1728"/>
           </w:tcPr>
           <w:p>
             <w:r>
@@ -3054,17 +518,17 @@
       <w:tr>
         <w:tc>
           <w:tcPr>
-            <w:tcW w:type="dxa" w:w="2160"/>
+            <w:tcW w:type="dxa" w:w="1728"/>
           </w:tcPr>
           <w:p>
             <w:r>
-              <w:t>Mature seller</w:t>
+              <w:t>Mature seller churn</w:t>
             </w:r>
           </w:p>
         </w:tc>
         <w:tc>
           <w:tcPr>
-            <w:tcW w:type="dxa" w:w="2160"/>
+            <w:tcW w:type="dxa" w:w="1728"/>
           </w:tcPr>
           <w:p>
             <w:r>
@@ -3074,7 +538,7 @@
         </w:tc>
         <w:tc>
           <w:tcPr>
-            <w:tcW w:type="dxa" w:w="2160"/>
+            <w:tcW w:type="dxa" w:w="1728"/>
           </w:tcPr>
           <w:p>
             <w:r>
@@ -3084,7 +548,17 @@
         </w:tc>
         <w:tc>
           <w:tcPr>
-            <w:tcW w:type="dxa" w:w="2160"/>
+            <w:tcW w:type="dxa" w:w="1728"/>
+          </w:tcPr>
+          <w:p>
+            <w:r>
+              <w:t>~4 months</w:t>
+            </w:r>
+          </w:p>
+        </w:tc>
+        <w:tc>
+          <w:tcPr>
+            <w:tcW w:type="dxa" w:w="1728"/>
           </w:tcPr>
           <w:p>
             <w:r>
@@ -3101,33 +575,129 @@
         <w:rPr>
           <w:b/>
         </w:rPr>
-        <w:t>Weighted %</w:t>
+        <w:t>Calendar weeks checked (for cohort `c`):</w:t>
       </w:r>
-      <w:r>
-        <w:t xml:space="preserve"> = </w:t>
-      </w:r>
-      <w:r>
-        <w:rPr>
-          <w:rFonts w:ascii="Courier New" w:hAnsi="Courier New"/>
-          <w:sz w:val="18"/>
-        </w:rPr>
-        <w:t>Σ churned ÷ Σ starters</w:t>
-      </w:r>
-      <w:r>
-        <w:t xml:space="preserve"> across eligible cohorts.</w:t>
-      </w:r>
+      <w:r/>
     </w:p>
+    <w:tbl>
+      <w:tblPr>
+        <w:tblStyle w:val="TableGrid"/>
+        <w:tblW w:type="auto" w:w="0"/>
+        <w:tblLook w:firstColumn="1" w:firstRow="1" w:lastColumn="0" w:lastRow="0" w:noHBand="0" w:noVBand="1" w:val="04A0"/>
+      </w:tblPr>
+      <w:tblGrid>
+        <w:gridCol w:w="4320"/>
+        <w:gridCol w:w="4320"/>
+      </w:tblGrid>
+      <w:tr>
+        <w:tc>
+          <w:tcPr>
+            <w:tcW w:type="dxa" w:w="4320"/>
+            <w:shd w:fill="E8EEF4" w:val="clear"/>
+          </w:tcPr>
+          <w:p>
+            <w:r>
+              <w:rPr>
+                <w:b/>
+              </w:rPr>
+              <w:t>Card</w:t>
+            </w:r>
+          </w:p>
+        </w:tc>
+        <w:tc>
+          <w:tcPr>
+            <w:tcW w:type="dxa" w:w="4320"/>
+            <w:shd w:fill="E8EEF4" w:val="clear"/>
+          </w:tcPr>
+          <w:p>
+            <w:r>
+              <w:rPr>
+                <w:b/>
+              </w:rPr>
+              <w:t>Retail weeks checked</w:t>
+            </w:r>
+          </w:p>
+        </w:tc>
+      </w:tr>
+      <w:tr>
+        <w:tc>
+          <w:tcPr>
+            <w:tcW w:type="dxa" w:w="4320"/>
+          </w:tcPr>
+          <w:p>
+            <w:r>
+              <w:t>New (W4)</w:t>
+            </w:r>
+          </w:p>
+        </w:tc>
+        <w:tc>
+          <w:tcPr>
+            <w:tcW w:type="dxa" w:w="4320"/>
+          </w:tcPr>
+          <w:p>
+            <w:r>
+              <w:t>c+1, c+2, c+3</w:t>
+            </w:r>
+          </w:p>
+        </w:tc>
+      </w:tr>
+      <w:tr>
+        <w:tc>
+          <w:tcPr>
+            <w:tcW w:type="dxa" w:w="4320"/>
+          </w:tcPr>
+          <w:p>
+            <w:r>
+              <w:t>Growing (W10)</w:t>
+            </w:r>
+          </w:p>
+        </w:tc>
+        <w:tc>
+          <w:tcPr>
+            <w:tcW w:type="dxa" w:w="4320"/>
+          </w:tcPr>
+          <w:p>
+            <w:r>
+              <w:t>c+7, c+8, c+9</w:t>
+            </w:r>
+          </w:p>
+        </w:tc>
+      </w:tr>
+      <w:tr>
+        <w:tc>
+          <w:tcPr>
+            <w:tcW w:type="dxa" w:w="4320"/>
+          </w:tcPr>
+          <w:p>
+            <w:r>
+              <w:t>Mature (W16)</w:t>
+            </w:r>
+          </w:p>
+        </w:tc>
+        <w:tc>
+          <w:tcPr>
+            <w:tcW w:type="dxa" w:w="4320"/>
+          </w:tcPr>
+          <w:p>
+            <w:r>
+              <w:t>c+13, c+14, c+15</w:t>
+            </w:r>
+          </w:p>
+        </w:tc>
+      </w:tr>
+    </w:tbl>
+    <w:p/>
     <w:p>
       <w:pPr>
         <w:pStyle w:val="Heading2"/>
       </w:pPr>
       <w:r>
-        <w:t>Heatmap (3-week gap churn)</w:t>
+        <w:t>Heatmap table — 3-week gap churn (from W4)</w:t>
       </w:r>
     </w:p>
     <w:p>
       <w:r>
-        <w:t xml:space="preserve">For column </w:t>
+        <w:t xml:space="preserve">Each column </w:t>
       </w:r>
       <w:r>
         <w:rPr>
@@ -3136,7 +706,7 @@
         <w:t>Wk</w:t>
       </w:r>
       <w:r>
-        <w:t xml:space="preserve"> where </w:t>
+        <w:t xml:space="preserve"> (</w:t>
       </w:r>
       <w:r>
         <w:rPr>
@@ -3146,6 +716,15 @@
         <w:t>k ≥ 4</w:t>
       </w:r>
       <w:r>
+        <w:t xml:space="preserve">) uses a </w:t>
+      </w:r>
+      <w:r>
+        <w:rPr>
+          <w:b/>
+        </w:rPr>
+        <w:t>rolling 3-week look-back</w:t>
+      </w:r>
+      <w:r>
         <w:t>:</w:t>
       </w:r>
     </w:p>
@@ -3153,25 +732,38 @@
       <w:pPr>
         <w:pStyle w:val="ListBullet"/>
       </w:pPr>
+      <w:r/>
       <w:r>
-        <w:t>Look-back window: W(k−3), W(k−2), W(k−1)</w:t>
+        <w:rPr>
+          <w:b/>
+        </w:rPr>
+        <w:t>Churned</w:t>
       </w:r>
+      <w:r>
+        <w:t xml:space="preserve"> if no stream in tenure weeks </w:t>
+      </w:r>
+      <w:r>
+        <w:rPr>
+          <w:b/>
+        </w:rPr>
+        <w:t>W(k−3), W(k−2), W(k−1)</w:t>
+      </w:r>
+      <w:r/>
     </w:p>
     <w:p>
       <w:pPr>
         <w:pStyle w:val="ListBullet"/>
       </w:pPr>
       <w:r>
-        <w:t>Churned if no stream in any of those three weeks</w:t>
+        <w:t xml:space="preserve">Calendar weeks: </w:t>
       </w:r>
-    </w:p>
-    <w:p>
-      <w:pPr>
-        <w:pStyle w:val="ListBullet"/>
-      </w:pPr>
       <w:r>
-        <w:t>Columns W1–W3 are blank (insufficient history)</w:t>
+        <w:rPr>
+          <w:b/>
+        </w:rPr>
+        <w:t>c+k−3, c+k−2, c+k−1</w:t>
       </w:r>
+      <w:r/>
     </w:p>
     <w:tbl>
       <w:tblPr>
@@ -3208,7 +800,7 @@
               <w:rPr>
                 <w:b/>
               </w:rPr>
-              <w:t>Window</w:t>
+              <w:t>Window (tenure weeks)</w:t>
             </w:r>
           </w:p>
         </w:tc>
@@ -3286,7 +878,7 @@
           </w:tcPr>
           <w:p>
             <w:r>
-              <w:t>W23</w:t>
+              <w:t>W16</w:t>
             </w:r>
           </w:p>
         </w:tc>
@@ -3296,7 +888,7 @@
           </w:tcPr>
           <w:p>
             <w:r>
-              <w:t>W20, W21, W22</w:t>
+              <w:t>W13, W14, W15</w:t>
             </w:r>
           </w:p>
         </w:tc>
@@ -3304,34 +896,281 @@
     </w:tbl>
     <w:p/>
     <w:p>
-      <w:pPr>
-        <w:pStyle w:val="Heading2"/>
-      </w:pPr>
       <w:r>
-        <w:t>Comebacks</w:t>
-      </w:r>
-    </w:p>
-    <w:p>
-      <w:r>
-        <w:t xml:space="preserve">Churn is evaluated </w:t>
+        <w:t xml:space="preserve">Cell value = </w:t>
       </w:r>
       <w:r>
         <w:rPr>
           <w:b/>
         </w:rPr>
-        <w:t>per column / milestone</w:t>
+        <w:t>Churn %</w:t>
       </w:r>
       <w:r>
-        <w:t xml:space="preserve">. If a seller streams again within the look-back window, they count as </w:t>
+        <w:t xml:space="preserve"> (</w:t>
+      </w:r>
+      <w:r>
+        <w:rPr>
+          <w:rFonts w:ascii="Courier New" w:hAnsi="Courier New"/>
+          <w:sz w:val="18"/>
+        </w:rPr>
+        <w:t>churned ÷ cohort size</w:t>
+      </w:r>
+      <w:r>
+        <w:t xml:space="preserve">) or </w:t>
       </w:r>
       <w:r>
         <w:rPr>
           <w:b/>
         </w:rPr>
-        <w:t>retained</w:t>
+        <w:t>Counts</w:t>
       </w:r>
       <w:r>
-        <w:t xml:space="preserve"> for that point.</w:t>
+        <w:t xml:space="preserve"> (raw churned count). Columns W1–W3 are blank.</w:t>
+      </w:r>
+    </w:p>
+    <w:p>
+      <w:r/>
+      <w:r>
+        <w:rPr>
+          <w:b/>
+        </w:rPr>
+        <w:t>Note:</w:t>
+      </w:r>
+      <w:r>
+        <w:t xml:space="preserve"> New seller card (W4) uses the same window as the </w:t>
+      </w:r>
+      <w:r>
+        <w:rPr>
+          <w:b/>
+        </w:rPr>
+        <w:t>W4 column</w:t>
+      </w:r>
+      <w:r>
+        <w:t>. Growing and mature cards use fixed windows (W7–W9, W13–W15), not necessarily the same as a single heatmap column label.</w:t>
+      </w:r>
+    </w:p>
+    <w:p>
+      <w:pPr>
+        <w:pStyle w:val="Heading2"/>
+      </w:pPr>
+      <w:r>
+        <w:t>Line chart</w:t>
+      </w:r>
+    </w:p>
+    <w:p>
+      <w:r>
+        <w:t xml:space="preserve">Per-cohort </w:t>
+      </w:r>
+      <w:r>
+        <w:rPr>
+          <w:b/>
+        </w:rPr>
+        <w:t>unweighted</w:t>
+      </w:r>
+      <w:r>
+        <w:t xml:space="preserve"> churn % at W4, W10, and W16 (same windows as summary cards). Mature line only includes cohorts with ≥16 weeks of data.</w:t>
+      </w:r>
+    </w:p>
+    <w:p>
+      <w:pPr>
+        <w:pStyle w:val="Heading2"/>
+      </w:pPr>
+      <w:r>
+        <w:t>Formula reference</w:t>
+      </w:r>
+    </w:p>
+    <w:p>
+      <w:pPr>
+        <w:ind w:left="240"/>
+      </w:pPr>
+      <w:r>
+        <w:rPr>
+          <w:rFonts w:ascii="Courier New" w:hAnsi="Courier New"/>
+          <w:sz w:val="18"/>
+        </w:rPr>
+        <w:t>c = cohort retail week (seller's first stream week in 2026)</w:t>
+        <w:br/>
+        <w:br/>
+        <w:t>NEW (W4):      churned ⟺ no stream in weeks c+1, c+2, c+3</w:t>
+        <w:br/>
+        <w:t>GROWING (W10): churned ⟺ no stream in weeks c+7, c+8, c+9</w:t>
+        <w:br/>
+        <w:t>MATURE (W16):  churned ⟺ no stream in weeks c+13, c+14, c+15</w:t>
+        <w:br/>
+        <w:br/>
+        <w:t>HEATMAP Wk:    churned ⟺ no stream in weeks c+k-3, c+k-2, c+k-1  (k ≥ 4)</w:t>
+        <w:br/>
+        <w:br/>
+        <w:t>SUMMARY CARD:  Σ(churned) / Σ(starters) × 100</w:t>
+        <w:br/>
+        <w:t>HEATMAP CELL:  gapChurn[k] / cohort_size × 100</w:t>
+      </w:r>
+    </w:p>
+    <w:p>
+      <w:pPr>
+        <w:pStyle w:val="Heading2"/>
+      </w:pPr>
+      <w:r>
+        <w:t>Where in code</w:t>
+      </w:r>
+    </w:p>
+    <w:tbl>
+      <w:tblPr>
+        <w:tblStyle w:val="TableGrid"/>
+        <w:tblW w:type="auto" w:w="0"/>
+        <w:tblLook w:firstColumn="1" w:firstRow="1" w:lastColumn="0" w:lastRow="0" w:noHBand="0" w:noVBand="1" w:val="04A0"/>
+      </w:tblPr>
+      <w:tblGrid>
+        <w:gridCol w:w="4320"/>
+        <w:gridCol w:w="4320"/>
+      </w:tblGrid>
+      <w:tr>
+        <w:tc>
+          <w:tcPr>
+            <w:tcW w:type="dxa" w:w="4320"/>
+            <w:shd w:fill="E8EEF4" w:val="clear"/>
+          </w:tcPr>
+          <w:p>
+            <w:r>
+              <w:rPr>
+                <w:b/>
+              </w:rPr>
+              <w:t>Function</w:t>
+            </w:r>
+          </w:p>
+        </w:tc>
+        <w:tc>
+          <w:tcPr>
+            <w:tcW w:type="dxa" w:w="4320"/>
+            <w:shd w:fill="E8EEF4" w:val="clear"/>
+          </w:tcPr>
+          <w:p>
+            <w:r>
+              <w:rPr>
+                <w:b/>
+              </w:rPr>
+              <w:t>Role</w:t>
+            </w:r>
+          </w:p>
+        </w:tc>
+      </w:tr>
+      <w:tr>
+        <w:tc>
+          <w:tcPr>
+            <w:tcW w:type="dxa" w:w="4320"/>
+          </w:tcPr>
+          <w:p>
+            <w:r>
+              <w:t>`compute()`</w:t>
+            </w:r>
+          </w:p>
+        </w:tc>
+        <w:tc>
+          <w:tcPr>
+            <w:tcW w:type="dxa" w:w="4320"/>
+          </w:tcPr>
+          <w:p>
+            <w:r>
+              <w:t>Assigns cohorts; calculates `gapChurn`, `earlyTenureChurn`, `midTenureChurn`, `matureTenureChurn`</w:t>
+            </w:r>
+          </w:p>
+        </w:tc>
+      </w:tr>
+      <w:tr>
+        <w:tc>
+          <w:tcPr>
+            <w:tcW w:type="dxa" w:w="4320"/>
+          </w:tcPr>
+          <w:p>
+            <w:r>
+              <w:t>`renderStats()`</w:t>
+            </w:r>
+          </w:p>
+        </w:tc>
+        <w:tc>
+          <w:tcPr>
+            <w:tcW w:type="dxa" w:w="4320"/>
+          </w:tcPr>
+          <w:p>
+            <w:r>
+              <w:t>Summary cards (weighted averages)</w:t>
+            </w:r>
+          </w:p>
+        </w:tc>
+      </w:tr>
+      <w:tr>
+        <w:tc>
+          <w:tcPr>
+            <w:tcW w:type="dxa" w:w="4320"/>
+          </w:tcPr>
+          <w:p>
+            <w:r>
+              <w:t>`renderTable()`</w:t>
+            </w:r>
+          </w:p>
+        </w:tc>
+        <w:tc>
+          <w:tcPr>
+            <w:tcW w:type="dxa" w:w="4320"/>
+          </w:tcPr>
+          <w:p>
+            <w:r>
+              <w:t>Heatmap from `gapChurn[]`</w:t>
+            </w:r>
+          </w:p>
+        </w:tc>
+      </w:tr>
+      <w:tr>
+        <w:tc>
+          <w:tcPr>
+            <w:tcW w:type="dxa" w:w="4320"/>
+          </w:tcPr>
+          <w:p>
+            <w:r>
+              <w:t>`renderChart()`</w:t>
+            </w:r>
+          </w:p>
+        </w:tc>
+        <w:tc>
+          <w:tcPr>
+            <w:tcW w:type="dxa" w:w="4320"/>
+          </w:tcPr>
+          <w:p>
+            <w:r>
+              <w:t>Per-cohort lines at W4 / W10 / W16</w:t>
+            </w:r>
+          </w:p>
+        </w:tc>
+      </w:tr>
+    </w:tbl>
+    <w:p/>
+    <w:p>
+      <w:r>
+        <w:t xml:space="preserve">Constants in </w:t>
+      </w:r>
+      <w:r>
+        <w:rPr>
+          <w:rFonts w:ascii="Courier New" w:hAnsi="Courier New"/>
+          <w:sz w:val="18"/>
+        </w:rPr>
+        <w:t>compute()</w:t>
+      </w:r>
+      <w:r>
+        <w:t>:</w:t>
+      </w:r>
+    </w:p>
+    <w:p>
+      <w:pPr>
+        <w:ind w:left="240"/>
+      </w:pPr>
+      <w:r>
+        <w:rPr>
+          <w:rFonts w:ascii="Courier New" w:hAnsi="Courier New"/>
+          <w:sz w:val="18"/>
+        </w:rPr>
+        <w:t>const EARLY_AT = 4, MID_AT = 10, MATURE_AT = 16;</w:t>
+        <w:br/>
+        <w:t>const EXCLUDED_COHORTS = new Set([21, 22, 23, 24]);</w:t>
       </w:r>
     </w:p>
     <w:p/>
@@ -3340,7 +1179,187 @@
         <w:pStyle w:val="Heading1"/>
       </w:pPr>
       <w:r>
-        <w:t>Filters</w:t>
+        <w:t>Seller cohorts</w:t>
+      </w:r>
+    </w:p>
+    <w:p>
+      <w:pPr>
+        <w:pStyle w:val="ListBullet"/>
+      </w:pPr>
+      <w:r/>
+      <w:r>
+        <w:rPr>
+          <w:b/>
+        </w:rPr>
+        <w:t>Cohort</w:t>
+      </w:r>
+      <w:r>
+        <w:t xml:space="preserve"> = retail week of seller’s </w:t>
+      </w:r>
+      <w:r>
+        <w:rPr>
+          <w:b/>
+        </w:rPr>
+        <w:t>first Live stream</w:t>
+      </w:r>
+      <w:r>
+        <w:t xml:space="preserve"> in 2026 (</w:t>
+      </w:r>
+      <w:r>
+        <w:rPr>
+          <w:rFonts w:ascii="Courier New" w:hAnsi="Courier New"/>
+          <w:sz w:val="18"/>
+        </w:rPr>
+        <w:t>26RW01</w:t>
+      </w:r>
+      <w:r>
+        <w:t xml:space="preserve"> … </w:t>
+      </w:r>
+      <w:r>
+        <w:rPr>
+          <w:rFonts w:ascii="Courier New" w:hAnsi="Courier New"/>
+          <w:sz w:val="18"/>
+        </w:rPr>
+        <w:t>26RW24</w:t>
+      </w:r>
+      <w:r>
+        <w:t>).</w:t>
+      </w:r>
+    </w:p>
+    <w:p>
+      <w:pPr>
+        <w:pStyle w:val="ListBullet"/>
+      </w:pPr>
+      <w:r/>
+      <w:r>
+        <w:rPr>
+          <w:b/>
+        </w:rPr>
+        <w:t>One seller → one cohort</w:t>
+      </w:r>
+      <w:r>
+        <w:t xml:space="preserve"> (</w:t>
+      </w:r>
+      <w:r>
+        <w:rPr>
+          <w:rFonts w:ascii="Courier New" w:hAnsi="Courier New"/>
+          <w:sz w:val="18"/>
+        </w:rPr>
+        <w:t>cohort = min(RETAIL_WEEK)</w:t>
+      </w:r>
+      <w:r>
+        <w:t xml:space="preserve"> per </w:t>
+      </w:r>
+      <w:r>
+        <w:rPr>
+          <w:rFonts w:ascii="Courier New" w:hAnsi="Courier New"/>
+          <w:sz w:val="18"/>
+        </w:rPr>
+        <w:t>SLR_ID</w:t>
+      </w:r>
+      <w:r>
+        <w:t>).</w:t>
+      </w:r>
+    </w:p>
+    <w:p>
+      <w:pPr>
+        <w:pStyle w:val="ListBullet"/>
+      </w:pPr>
+      <w:r/>
+      <w:r>
+        <w:rPr>
+          <w:b/>
+        </w:rPr>
+        <w:t>Excluded from dashboard:</w:t>
+      </w:r>
+      <w:r>
+        <w:t xml:space="preserve"> cohorts 21–24 (insufficient follow-up).</w:t>
+      </w:r>
+    </w:p>
+    <w:p>
+      <w:pPr>
+        <w:pStyle w:val="ListBullet"/>
+      </w:pPr>
+      <w:r/>
+      <w:r>
+        <w:rPr>
+          <w:b/>
+        </w:rPr>
+        <w:t>~2,570 sellers</w:t>
+      </w:r>
+      <w:r>
+        <w:t xml:space="preserve"> in current extract; data through retail week 24.</w:t>
+      </w:r>
+    </w:p>
+    <w:p>
+      <w:r/>
+      <w:r>
+        <w:rPr>
+          <w:b/>
+        </w:rPr>
+        <w:t>Source data:</w:t>
+      </w:r>
+      <w:r>
+        <w:t xml:space="preserve"> each CSV row is one stream (</w:t>
+      </w:r>
+      <w:r>
+        <w:rPr>
+          <w:rFonts w:ascii="Courier New" w:hAnsi="Courier New"/>
+          <w:sz w:val="18"/>
+        </w:rPr>
+        <w:t>ID</w:t>
+      </w:r>
+      <w:r>
+        <w:t xml:space="preserve"> = stream id, </w:t>
+      </w:r>
+      <w:r>
+        <w:rPr>
+          <w:rFonts w:ascii="Courier New" w:hAnsi="Courier New"/>
+          <w:sz w:val="18"/>
+        </w:rPr>
+        <w:t>SLR_ID</w:t>
+      </w:r>
+      <w:r>
+        <w:t xml:space="preserve"> = seller). Cohort uses minimum </w:t>
+      </w:r>
+      <w:r>
+        <w:rPr>
+          <w:rFonts w:ascii="Courier New" w:hAnsi="Courier New"/>
+          <w:sz w:val="18"/>
+        </w:rPr>
+        <w:t>RETAIL_WEEK</w:t>
+      </w:r>
+      <w:r>
+        <w:t xml:space="preserve"> across all rows for that seller (matches </w:t>
+      </w:r>
+      <w:r>
+        <w:rPr>
+          <w:rFonts w:ascii="Courier New" w:hAnsi="Courier New"/>
+          <w:sz w:val="18"/>
+        </w:rPr>
+        <w:t>first_stream_dt</w:t>
+      </w:r>
+      <w:r>
+        <w:t xml:space="preserve"> / earliest </w:t>
+      </w:r>
+      <w:r>
+        <w:rPr>
+          <w:rFonts w:ascii="Courier New" w:hAnsi="Courier New"/>
+          <w:sz w:val="18"/>
+        </w:rPr>
+        <w:t>STRT_TM</w:t>
+      </w:r>
+      <w:r>
+        <w:t>).</w:t>
+      </w:r>
+    </w:p>
+    <w:p/>
+    <w:p>
+      <w:pPr>
+        <w:pStyle w:val="Heading1"/>
+      </w:pPr>
+      <w:r>
+        <w:t>Dashboard sections</w:t>
       </w:r>
     </w:p>
     <w:tbl>
@@ -3365,7 +1384,7 @@
               <w:rPr>
                 <w:b/>
               </w:rPr>
-              <w:t>Filter</w:t>
+              <w:t>Section</w:t>
             </w:r>
           </w:p>
         </w:tc>
@@ -3379,7 +1398,7 @@
               <w:rPr>
                 <w:b/>
               </w:rPr>
-              <w:t>Field</w:t>
+              <w:t>What it shows</w:t>
             </w:r>
           </w:p>
         </w:tc>
@@ -3393,7 +1412,7 @@
               <w:rPr>
                 <w:b/>
               </w:rPr>
-              <w:t>Effect on `compute()`</w:t>
+              <w:t>Calculation source</w:t>
             </w:r>
           </w:p>
         </w:tc>
@@ -3405,7 +1424,7 @@
           </w:tcPr>
           <w:p>
             <w:r>
-              <w:t>Seller Country</w:t>
+              <w:t>Total sellers</w:t>
             </w:r>
           </w:p>
         </w:tc>
@@ -3415,7 +1434,7 @@
           </w:tcPr>
           <w:p>
             <w:r>
-              <w:t>`SELLER_COUNTRY`</w:t>
+              <w:t>Count across cohort rows</w:t>
             </w:r>
           </w:p>
         </w:tc>
@@ -3425,7 +1444,7 @@
           </w:tcPr>
           <w:p>
             <w:r>
-              <w:t>Excludes entire seller if country doesn’t match</w:t>
+              <w:t>`sum(cohort sizes)` — not churn</w:t>
             </w:r>
           </w:p>
         </w:tc>
@@ -3437,7 +1456,7 @@
           </w:tcPr>
           <w:p>
             <w:r>
-              <w:t>Sub category</w:t>
+              <w:t>Summary cards (4)</w:t>
             </w:r>
           </w:p>
         </w:tc>
@@ -3447,7 +1466,7 @@
           </w:tcPr>
           <w:p>
             <w:r>
-              <w:t>`FCSD_VRTCL_SUP_GRP_revised`</w:t>
+              <w:t>Total + 3 weighted churn %</w:t>
             </w:r>
           </w:p>
         </w:tc>
@@ -3457,7 +1476,328 @@
           </w:tcPr>
           <w:p>
             <w:r>
-              <w:t>Only stream weeks in selected verticals count toward `weeks` set</w:t>
+              <w:t>`renderStats()` ← `compute()`</w:t>
+            </w:r>
+          </w:p>
+        </w:tc>
+      </w:tr>
+      <w:tr>
+        <w:tc>
+          <w:tcPr>
+            <w:tcW w:type="dxa" w:w="2880"/>
+          </w:tcPr>
+          <w:p>
+            <w:r>
+              <w:t>Country / Sub category filters</w:t>
+            </w:r>
+          </w:p>
+        </w:tc>
+        <w:tc>
+          <w:tcPr>
+            <w:tcW w:type="dxa" w:w="2880"/>
+          </w:tcPr>
+          <w:p>
+            <w:r>
+              <w:t>Subset of sellers/streams</w:t>
+            </w:r>
+          </w:p>
+        </w:tc>
+        <w:tc>
+          <w:tcPr>
+            <w:tcW w:type="dxa" w:w="2880"/>
+          </w:tcPr>
+          <w:p>
+            <w:r>
+              <w:t>Re-runs `compute()`</w:t>
+            </w:r>
+          </w:p>
+        </w:tc>
+      </w:tr>
+      <w:tr>
+        <w:tc>
+          <w:tcPr>
+            <w:tcW w:type="dxa" w:w="2880"/>
+          </w:tcPr>
+          <w:p>
+            <w:r>
+              <w:t>Churn % / Counts toggle</w:t>
+            </w:r>
+          </w:p>
+        </w:tc>
+        <w:tc>
+          <w:tcPr>
+            <w:tcW w:type="dxa" w:w="2880"/>
+          </w:tcPr>
+          <w:p>
+            <w:r>
+              <w:t>Heatmap display mode</w:t>
+            </w:r>
+          </w:p>
+        </w:tc>
+        <w:tc>
+          <w:tcPr>
+            <w:tcW w:type="dxa" w:w="2880"/>
+          </w:tcPr>
+          <w:p>
+            <w:r>
+              <w:t>`renderTable()` only</w:t>
+            </w:r>
+          </w:p>
+        </w:tc>
+      </w:tr>
+      <w:tr>
+        <w:tc>
+          <w:tcPr>
+            <w:tcW w:type="dxa" w:w="2880"/>
+          </w:tcPr>
+          <w:p>
+            <w:r>
+              <w:t>Heatmap table</w:t>
+            </w:r>
+          </w:p>
+        </w:tc>
+        <w:tc>
+          <w:tcPr>
+            <w:tcW w:type="dxa" w:w="2880"/>
+          </w:tcPr>
+          <w:p>
+            <w:r>
+              <w:t>Cohort rows × W4+ columns</w:t>
+            </w:r>
+          </w:p>
+        </w:tc>
+        <w:tc>
+          <w:tcPr>
+            <w:tcW w:type="dxa" w:w="2880"/>
+          </w:tcPr>
+          <w:p>
+            <w:r>
+              <w:t>`gapChurn[]` from `compute()`</w:t>
+            </w:r>
+          </w:p>
+        </w:tc>
+      </w:tr>
+      <w:tr>
+        <w:tc>
+          <w:tcPr>
+            <w:tcW w:type="dxa" w:w="2880"/>
+          </w:tcPr>
+          <w:p>
+            <w:r>
+              <w:t>Color legend</w:t>
+            </w:r>
+          </w:p>
+        </w:tc>
+        <w:tc>
+          <w:tcPr>
+            <w:tcW w:type="dxa" w:w="2880"/>
+          </w:tcPr>
+          <w:p>
+            <w:r>
+              <w:t>Green (low churn) → red (high)</w:t>
+            </w:r>
+          </w:p>
+        </w:tc>
+        <w:tc>
+          <w:tcPr>
+            <w:tcW w:type="dxa" w:w="2880"/>
+          </w:tcPr>
+          <w:p>
+            <w:r>
+              <w:t>`heatStyle()`</w:t>
+            </w:r>
+          </w:p>
+        </w:tc>
+      </w:tr>
+      <w:tr>
+        <w:tc>
+          <w:tcPr>
+            <w:tcW w:type="dxa" w:w="2880"/>
+          </w:tcPr>
+          <w:p>
+            <w:r>
+              <w:t>Line chart</w:t>
+            </w:r>
+          </w:p>
+        </w:tc>
+        <w:tc>
+          <w:tcPr>
+            <w:tcW w:type="dxa" w:w="2880"/>
+          </w:tcPr>
+          <w:p>
+            <w:r>
+              <w:t>Cohort week vs churn %</w:t>
+            </w:r>
+          </w:p>
+        </w:tc>
+        <w:tc>
+          <w:tcPr>
+            <w:tcW w:type="dxa" w:w="2880"/>
+          </w:tcPr>
+          <w:p>
+            <w:r>
+              <w:t>Per-cohort % from `compute()`</w:t>
+            </w:r>
+          </w:p>
+        </w:tc>
+      </w:tr>
+    </w:tbl>
+    <w:p/>
+    <w:p>
+      <w:r>
+        <w:t xml:space="preserve">Retail weeks are </w:t>
+      </w:r>
+      <w:r>
+        <w:rPr>
+          <w:b/>
+        </w:rPr>
+        <w:t>Sunday–Saturday</w:t>
+      </w:r>
+      <w:r>
+        <w:t>; 26RW01 = Jan 4–10, 2026. Full calendar is in dashboard HTML (</w:t>
+      </w:r>
+      <w:r>
+        <w:rPr>
+          <w:rFonts w:ascii="Courier New" w:hAnsi="Courier New"/>
+          <w:sz w:val="18"/>
+        </w:rPr>
+        <w:t>RW_DATES</w:t>
+      </w:r>
+      <w:r>
+        <w:t>).</w:t>
+      </w:r>
+    </w:p>
+    <w:p/>
+    <w:p>
+      <w:pPr>
+        <w:pStyle w:val="Heading1"/>
+      </w:pPr>
+      <w:r>
+        <w:t>Project files</w:t>
+      </w:r>
+    </w:p>
+    <w:p>
+      <w:pPr>
+        <w:ind w:left="240"/>
+      </w:pPr>
+      <w:r>
+        <w:rPr>
+          <w:rFonts w:ascii="Courier New" w:hAnsi="Courier New"/>
+          <w:sz w:val="18"/>
+        </w:rPr>
+        <w:t>data/raw/streams_first_stream_2026.csv     ← INPUT (stream extract)</w:t>
+        <w:br/>
+        <w:t>data/processed/canvas_data.json            ← built by scripts/build_canvas.py</w:t>
+        <w:br/>
+        <w:t>dashboard/live_seller_churn_dashboard_20260618.html  ← DASHBOARD + churn math</w:t>
+        <w:br/>
+        <w:t>scripts/build_canvas.py                    ← CSV → JSON (no churn)</w:t>
+        <w:br/>
+        <w:t>tools/check.js, tools/harness.js           ← optional validation</w:t>
+      </w:r>
+    </w:p>
+    <w:tbl>
+      <w:tblPr>
+        <w:tblStyle w:val="TableGrid"/>
+        <w:tblW w:type="auto" w:w="0"/>
+        <w:tblLook w:firstColumn="1" w:firstRow="1" w:lastColumn="0" w:lastRow="0" w:noHBand="0" w:noVBand="1" w:val="04A0"/>
+      </w:tblPr>
+      <w:tblGrid>
+        <w:gridCol w:w="4320"/>
+        <w:gridCol w:w="4320"/>
+      </w:tblGrid>
+      <w:tr>
+        <w:tc>
+          <w:tcPr>
+            <w:tcW w:type="dxa" w:w="4320"/>
+            <w:shd w:fill="E8EEF4" w:val="clear"/>
+          </w:tcPr>
+          <w:p>
+            <w:r>
+              <w:rPr>
+                <w:b/>
+              </w:rPr>
+              <w:t>File</w:t>
+            </w:r>
+          </w:p>
+        </w:tc>
+        <w:tc>
+          <w:tcPr>
+            <w:tcW w:type="dxa" w:w="4320"/>
+            <w:shd w:fill="E8EEF4" w:val="clear"/>
+          </w:tcPr>
+          <w:p>
+            <w:r>
+              <w:rPr>
+                <w:b/>
+              </w:rPr>
+              <w:t>Calculates churn?</w:t>
+            </w:r>
+          </w:p>
+        </w:tc>
+      </w:tr>
+      <w:tr>
+        <w:tc>
+          <w:tcPr>
+            <w:tcW w:type="dxa" w:w="4320"/>
+          </w:tcPr>
+          <w:p>
+            <w:r>
+              <w:t>`dashboard/live_seller_churn_dashboard_20260618.html`</w:t>
+            </w:r>
+          </w:p>
+        </w:tc>
+        <w:tc>
+          <w:tcPr>
+            <w:tcW w:type="dxa" w:w="4320"/>
+          </w:tcPr>
+          <w:p>
+            <w:r>
+              <w:t>Yes — all metrics</w:t>
+            </w:r>
+          </w:p>
+        </w:tc>
+      </w:tr>
+      <w:tr>
+        <w:tc>
+          <w:tcPr>
+            <w:tcW w:type="dxa" w:w="4320"/>
+          </w:tcPr>
+          <w:p>
+            <w:r>
+              <w:t>`scripts/build_canvas.py`</w:t>
+            </w:r>
+          </w:p>
+        </w:tc>
+        <w:tc>
+          <w:tcPr>
+            <w:tcW w:type="dxa" w:w="4320"/>
+          </w:tcPr>
+          <w:p>
+            <w:r>
+              <w:t>No — ETL only</w:t>
+            </w:r>
+          </w:p>
+        </w:tc>
+      </w:tr>
+      <w:tr>
+        <w:tc>
+          <w:tcPr>
+            <w:tcW w:type="dxa" w:w="4320"/>
+          </w:tcPr>
+          <w:p>
+            <w:r>
+              <w:t>`data/raw/*.csv`, `data/processed/*.json`</w:t>
+            </w:r>
+          </w:p>
+        </w:tc>
+        <w:tc>
+          <w:tcPr>
+            <w:tcW w:type="dxa" w:w="4320"/>
+          </w:tcPr>
+          <w:p>
+            <w:r>
+              <w:t>No — raw / structured data</w:t>
             </w:r>
           </w:p>
         </w:tc>
@@ -3470,19 +1810,109 @@
         <w:rPr>
           <w:b/>
         </w:rPr>
-        <w:t>Sub category edge case:</w:t>
+        <w:t>Data flow:</w:t>
       </w:r>
       <w:r>
-        <w:t xml:space="preserve"> If a seller’s first stream was in a vertical not selected, their cohort week can shift to the earliest week </w:t>
+        <w:t xml:space="preserve"> CSV → </w:t>
       </w:r>
+      <w:r>
+        <w:rPr>
+          <w:rFonts w:ascii="Courier New" w:hAnsi="Courier New"/>
+          <w:sz w:val="18"/>
+        </w:rPr>
+        <w:t>build_canvas.py</w:t>
+      </w:r>
+      <w:r>
+        <w:t xml:space="preserve"> → JSON → embedded as </w:t>
+      </w:r>
+      <w:r>
+        <w:rPr>
+          <w:rFonts w:ascii="Courier New" w:hAnsi="Courier New"/>
+          <w:sz w:val="18"/>
+        </w:rPr>
+        <w:t>const DATA</w:t>
+      </w:r>
+      <w:r>
+        <w:t xml:space="preserve"> in HTML → </w:t>
+      </w:r>
+      <w:r>
+        <w:rPr>
+          <w:rFonts w:ascii="Courier New" w:hAnsi="Courier New"/>
+          <w:sz w:val="18"/>
+        </w:rPr>
+        <w:t>compute()</w:t>
+      </w:r>
+      <w:r>
+        <w:t xml:space="preserve"> in browser.</w:t>
+      </w:r>
+    </w:p>
+    <w:p/>
+    <w:p>
+      <w:pPr>
+        <w:pStyle w:val="Heading1"/>
+      </w:pPr>
+      <w:r>
+        <w:t>Filters and edge cases</w:t>
+      </w:r>
+    </w:p>
+    <w:p>
+      <w:pPr>
+        <w:pStyle w:val="ListBullet"/>
+      </w:pPr>
+      <w:r/>
       <w:r>
         <w:rPr>
           <w:b/>
         </w:rPr>
-        <w:t>in the filtered vertical</w:t>
+        <w:t>Country:</w:t>
       </w:r>
       <w:r>
-        <w:t>, which may differ from their true first-stream cohort.</w:t>
+        <w:t xml:space="preserve"> removes sellers not matching selection. "Other Countries" hidden from dropdown but included when filter is empty (All).</w:t>
+      </w:r>
+    </w:p>
+    <w:p>
+      <w:pPr>
+        <w:pStyle w:val="ListBullet"/>
+      </w:pPr>
+      <w:r/>
+      <w:r>
+        <w:rPr>
+          <w:b/>
+        </w:rPr>
+        <w:t>Sub category:</w:t>
+      </w:r>
+      <w:r>
+        <w:t xml:space="preserve"> only streams in selected verticals count toward week sets; can affect cohort in edge cases.</w:t>
+      </w:r>
+    </w:p>
+    <w:p>
+      <w:pPr>
+        <w:pStyle w:val="ListBullet"/>
+      </w:pPr>
+      <w:r/>
+      <w:r>
+        <w:rPr>
+          <w:b/>
+        </w:rPr>
+        <w:t>Mature churn</w:t>
+      </w:r>
+      <w:r>
+        <w:t xml:space="preserve"> has a smaller denominator (only early cohorts reach W16 with data through week 24).</w:t>
+      </w:r>
+    </w:p>
+    <w:p>
+      <w:pPr>
+        <w:pStyle w:val="ListBullet"/>
+      </w:pPr>
+      <w:r/>
+      <w:r>
+        <w:rPr>
+          <w:b/>
+        </w:rPr>
+        <w:t>Comebacks:</w:t>
+      </w:r>
+      <w:r>
+        <w:t xml:space="preserve"> streaming within the look-back window = retained for that measurement.</w:t>
       </w:r>
     </w:p>
     <w:p/>
@@ -3496,15 +1926,6 @@
     </w:p>
     <w:p>
       <w:pPr>
-        <w:pStyle w:val="Heading2"/>
-      </w:pPr>
-      <w:r>
-        <w:t>View dashboard</w:t>
-      </w:r>
-    </w:p>
-    <w:p>
-      <w:pPr>
-        <w:spacing w:before="120" w:after="120"/>
         <w:ind w:left="240"/>
       </w:pPr>
       <w:r>
@@ -3512,76 +1933,21 @@
           <w:rFonts w:ascii="Courier New" w:hAnsi="Courier New"/>
           <w:sz w:val="18"/>
         </w:rPr>
+        <w:t># Open dashboard</w:t>
+        <w:br/>
         <w:t>open dashboard/live_seller_churn_dashboard_20260618.html</w:t>
-      </w:r>
-    </w:p>
-    <w:p>
-      <w:pPr>
-        <w:pStyle w:val="Heading2"/>
-      </w:pPr>
-      <w:r>
-        <w:t>Refresh processed data</w:t>
-      </w:r>
-    </w:p>
-    <w:p>
-      <w:pPr>
-        <w:spacing w:before="120" w:after="120"/>
-        <w:ind w:left="240"/>
-      </w:pPr>
-      <w:r>
-        <w:rPr>
-          <w:rFonts w:ascii="Courier New" w:hAnsi="Courier New"/>
-          <w:sz w:val="18"/>
-        </w:rPr>
+        <w:br/>
+        <w:br/>
+        <w:t># Refresh JSON from CSV</w:t>
+        <w:br/>
         <w:t>python scripts/build_canvas.py</w:t>
         <w:br/>
-        <w:t># → writes data/processed/canvas_data.json</w:t>
-      </w:r>
-    </w:p>
-    <w:p>
-      <w:r>
-        <w:t xml:space="preserve">Then re-embed JSON into </w:t>
-      </w:r>
-      <w:r>
-        <w:rPr>
-          <w:rFonts w:ascii="Courier New" w:hAnsi="Courier New"/>
-          <w:sz w:val="18"/>
-        </w:rPr>
-        <w:t>dashboard/live_seller_churn_dashboard_20260618.html</w:t>
-      </w:r>
-      <w:r>
-        <w:t xml:space="preserve"> (</w:t>
-      </w:r>
-      <w:r>
-        <w:rPr>
-          <w:rFonts w:ascii="Courier New" w:hAnsi="Courier New"/>
-          <w:sz w:val="18"/>
-        </w:rPr>
-        <w:t>const DATA = …</w:t>
-      </w:r>
-      <w:r>
-        <w:t>).</w:t>
-      </w:r>
-    </w:p>
-    <w:p>
-      <w:pPr>
-        <w:pStyle w:val="Heading2"/>
-      </w:pPr>
-      <w:r>
-        <w:t>Validate</w:t>
-      </w:r>
-    </w:p>
-    <w:p>
-      <w:pPr>
-        <w:spacing w:before="120" w:after="120"/>
-        <w:ind w:left="240"/>
-      </w:pPr>
-      <w:r>
-        <w:rPr>
-          <w:rFonts w:ascii="Courier New" w:hAnsi="Courier New"/>
-          <w:sz w:val="18"/>
-        </w:rPr>
-        <w:t>cd tools &amp;&amp; node harness.js</w:t>
+        <w:t># Then re-embed data/processed/canvas_data.json into the HTML const DATA block</w:t>
+        <w:br/>
+        <w:br/>
+        <w:t># Regenerate this Word document</w:t>
+        <w:br/>
+        <w:t>python scripts/build_documentation_docx.py</w:t>
       </w:r>
     </w:p>
     <w:p/>
@@ -3590,12 +1956,7 @@
         <w:pStyle w:val="Heading1"/>
       </w:pPr>
       <w:r>
-        <w:t>Maintenance checklist</w:t>
-      </w:r>
-    </w:p>
-    <w:p>
-      <w:r>
-        <w:t>When new stream data arrives:</w:t>
+        <w:t>Maintenance</w:t>
       </w:r>
     </w:p>
     <w:p>
@@ -3603,7 +1964,7 @@
         <w:pStyle w:val="ListNumber"/>
       </w:pPr>
       <w:r>
-        <w:t xml:space="preserve">Replace </w:t>
+        <w:t xml:space="preserve">Update </w:t>
       </w:r>
       <w:r>
         <w:rPr>
@@ -3635,33 +1996,7 @@
         <w:pStyle w:val="ListNumber"/>
       </w:pPr>
       <w:r>
-        <w:t xml:space="preserve">Embed </w:t>
-      </w:r>
-      <w:r>
-        <w:rPr>
-          <w:rFonts w:ascii="Courier New" w:hAnsi="Courier New"/>
-          <w:sz w:val="18"/>
-        </w:rPr>
-        <w:t>data/processed/canvas_data.json</w:t>
-      </w:r>
-      <w:r>
-        <w:t xml:space="preserve"> into </w:t>
-      </w:r>
-      <w:r>
-        <w:rPr>
-          <w:rFonts w:ascii="Courier New" w:hAnsi="Courier New"/>
-          <w:sz w:val="18"/>
-        </w:rPr>
-        <w:t>dashboard/live_seller_churn_dashboard_20260618.html</w:t>
-      </w:r>
-      <w:r/>
-    </w:p>
-    <w:p>
-      <w:pPr>
-        <w:pStyle w:val="ListNumber"/>
-      </w:pPr>
-      <w:r>
-        <w:t>Open dashboard — verify total sellers and summary card denominators</w:t>
+        <w:t>Re-embed JSON into dashboard HTML</w:t>
       </w:r>
     </w:p>
     <w:p>
@@ -3669,16 +2004,16 @@
         <w:pStyle w:val="ListNumber"/>
       </w:pPr>
       <w:r>
-        <w:t xml:space="preserve">If churn </w:t>
+        <w:t xml:space="preserve">To </w:t>
       </w:r>
       <w:r>
         <w:rPr>
           <w:b/>
         </w:rPr>
-        <w:t>logic</w:t>
+        <w:t>change churn definitions</w:t>
       </w:r>
       <w:r>
-        <w:t xml:space="preserve"> changed, edit </w:t>
+        <w:t xml:space="preserve">, edit </w:t>
       </w:r>
       <w:r>
         <w:rPr>
@@ -3687,17 +2022,7 @@
         <w:t>`compute()`</w:t>
       </w:r>
       <w:r>
-        <w:t xml:space="preserve"> in the HTML (and sync </w:t>
-      </w:r>
-      <w:r>
-        <w:rPr>
-          <w:rFonts w:ascii="Courier New" w:hAnsi="Courier New"/>
-          <w:sz w:val="18"/>
-        </w:rPr>
-        <w:t>tools/check.js</w:t>
-      </w:r>
-      <w:r>
-        <w:t xml:space="preserve"> if you use harness)</w:t>
+        <w:t xml:space="preserve"> in the dashboard HTML</w:t>
       </w:r>
     </w:p>
     <w:p>
@@ -3705,12 +2030,7 @@
         <w:pStyle w:val="ListNumber"/>
       </w:pPr>
       <w:r>
-        <w:t>Commit and push</w:t>
-      </w:r>
-    </w:p>
-    <w:p>
-      <w:r>
-        <w:t xml:space="preserve">To refresh the Word documentation after README edits: </w:t>
+        <w:t xml:space="preserve">Run </w:t>
       </w:r>
       <w:r>
         <w:rPr>
@@ -3719,43 +2039,8 @@
         </w:rPr>
         <w:t>python scripts/build_documentation_docx.py</w:t>
       </w:r>
-      <w:r/>
-    </w:p>
-    <w:p/>
-    <w:p>
-      <w:pPr>
-        <w:pStyle w:val="Heading1"/>
-      </w:pPr>
       <w:r>
-        <w:t>Formula quick reference</w:t>
-      </w:r>
-    </w:p>
-    <w:p>
-      <w:pPr>
-        <w:spacing w:before="120" w:after="120"/>
-        <w:ind w:left="240"/>
-      </w:pPr>
-      <w:r>
-        <w:rPr>
-          <w:rFonts w:ascii="Courier New" w:hAnsi="Courier New"/>
-          <w:sz w:val="18"/>
-        </w:rPr>
-        <w:t>c = cohort retail week (seller's first stream week)</w:t>
-        <w:br/>
-        <w:br/>
-        <w:t>NEW SELLER (W4):    churned ⟺ no stream in weeks c+1, c+2, c+3</w:t>
-        <w:br/>
-        <w:t>GROWING (W10):      churned ⟺ no stream in weeks c+7, c+8, c+9</w:t>
-        <w:br/>
-        <w:t>MATURE (W16):       churned ⟺ no stream in weeks c+13, c+14, c+15</w:t>
-        <w:br/>
-        <w:br/>
-        <w:t>HEATMAP at Wk:      churned ⟺ no stream in weeks c+k-3, c+k-2, c+k-1  (k ≥ 4)</w:t>
-        <w:br/>
-        <w:br/>
-        <w:t>WEIGHTED CARD %:    Σ(churned counts) / Σ(starter counts) × 100</w:t>
-        <w:br/>
-        <w:t>COHORT LINE CHART:  churned_count / cohort_size × 100  (per cohort, unweighted)</w:t>
+        <w:t xml:space="preserve"> to refresh this document</w:t>
       </w:r>
     </w:p>
     <w:p/>
@@ -3764,7 +2049,7 @@
         <w:pStyle w:val="Heading1"/>
       </w:pPr>
       <w:r>
-        <w:t>Summary: which file for what?</w:t>
+        <w:t>Glossary</w:t>
       </w:r>
     </w:p>
     <w:tbl>
@@ -3788,7 +2073,7 @@
               <w:rPr>
                 <w:b/>
               </w:rPr>
-              <w:t>I want to…</w:t>
+              <w:t>Term</w:t>
             </w:r>
           </w:p>
         </w:tc>
@@ -3802,7 +2087,7 @@
               <w:rPr>
                 <w:b/>
               </w:rPr>
-              <w:t>File</w:t>
+              <w:t>Meaning</w:t>
             </w:r>
           </w:p>
         </w:tc>
@@ -3814,7 +2099,7 @@
           </w:tcPr>
           <w:p>
             <w:r>
-              <w:t>Change how churn is defined</w:t>
+              <w:t>Cohort</w:t>
             </w:r>
           </w:p>
         </w:tc>
@@ -3824,7 +2109,7 @@
           </w:tcPr>
           <w:p>
             <w:r>
-              <w:t>`dashboard/live_seller_churn_dashboard_20260618.html` → `compute()`</w:t>
+              <w:t>Sellers whose first Live stream was in the same 2026 retail week</w:t>
             </w:r>
           </w:p>
         </w:tc>
@@ -3836,7 +2121,7 @@
           </w:tcPr>
           <w:p>
             <w:r>
-              <w:t>Change summary card weighting or labels</w:t>
+              <w:t>Tenure week Wk</w:t>
             </w:r>
           </w:p>
         </w:tc>
@@ -3846,7 +2131,7 @@
           </w:tcPr>
           <w:p>
             <w:r>
-              <w:t>Same file → `renderStats()`</w:t>
+              <w:t>Retail week `c + k` relative to cohort week `c`</w:t>
             </w:r>
           </w:p>
         </w:tc>
@@ -3858,7 +2143,7 @@
           </w:tcPr>
           <w:p>
             <w:r>
-              <w:t>Change heatmap or table</w:t>
+              <w:t>Churned</w:t>
             </w:r>
           </w:p>
         </w:tc>
@@ -3868,7 +2153,7 @@
           </w:tcPr>
           <w:p>
             <w:r>
-              <w:t>Same file → `renderTable()`</w:t>
+              <w:t>No stream in the defined week window</w:t>
             </w:r>
           </w:p>
         </w:tc>
@@ -3880,7 +2165,7 @@
           </w:tcPr>
           <w:p>
             <w:r>
-              <w:t>Change line chart</w:t>
+              <w:t>Retained</w:t>
             </w:r>
           </w:p>
         </w:tc>
@@ -3890,7 +2175,7 @@
           </w:tcPr>
           <w:p>
             <w:r>
-              <w:t>Same file → `renderChart()`</w:t>
+              <w:t>At least one stream in the window</w:t>
             </w:r>
           </w:p>
         </w:tc>
@@ -3902,7 +2187,7 @@
           </w:tcPr>
           <w:p>
             <w:r>
-              <w:t>Add / refresh source data</w:t>
+              <w:t>Weighted average</w:t>
             </w:r>
           </w:p>
         </w:tc>
@@ -3912,7 +2197,7 @@
           </w:tcPr>
           <w:p>
             <w:r>
-              <w:t>`data/raw/streams_first_stream_2026.csv`</w:t>
+              <w:t>Sum of churned ÷ sum of starters across cohorts</w:t>
             </w:r>
           </w:p>
         </w:tc>
@@ -3924,7 +2209,7 @@
           </w:tcPr>
           <w:p>
             <w:r>
-              <w:t>Regenerate seller JSON</w:t>
+              <w:t>maxWeek</w:t>
             </w:r>
           </w:p>
         </w:tc>
@@ -3934,51 +2219,7 @@
           </w:tcPr>
           <w:p>
             <w:r>
-              <w:t>`scripts/build_canvas.py`</w:t>
-            </w:r>
-          </w:p>
-        </w:tc>
-      </w:tr>
-      <w:tr>
-        <w:tc>
-          <w:tcPr>
-            <w:tcW w:type="dxa" w:w="4320"/>
-          </w:tcPr>
-          <w:p>
-            <w:r>
-              <w:t>Test compute() without browser</w:t>
-            </w:r>
-          </w:p>
-        </w:tc>
-        <w:tc>
-          <w:tcPr>
-            <w:tcW w:type="dxa" w:w="4320"/>
-          </w:tcPr>
-          <w:p>
-            <w:r>
-              <w:t>`tools/harness.js` + `tools/check.js`</w:t>
-            </w:r>
-          </w:p>
-        </w:tc>
-      </w:tr>
-      <w:tr>
-        <w:tc>
-          <w:tcPr>
-            <w:tcW w:type="dxa" w:w="4320"/>
-          </w:tcPr>
-          <w:p>
-            <w:r>
-              <w:t>Use legacy active/churned view</w:t>
-            </w:r>
-          </w:p>
-        </w:tc>
-        <w:tc>
-          <w:tcPr>
-            <w:tcW w:type="dxa" w:w="4320"/>
-          </w:tcPr>
-          <w:p>
-            <w:r>
-              <w:t>`scripts/build_html.py` (different metrics)</w:t>
+              <w:t>Latest retail week in the filtered dataset</w:t>
             </w:r>
           </w:p>
         </w:tc>

</xml_diff>